<commit_message>
Apply P2 audit fixes; rebuild P2 decks and printed set
Co-Authored-By: Claude Sonnet 5.5 <noreply@anthropic.com>
Claude-Session: https://claude.ai/code/session_01NYgB3ju57UwWRpkPPM6X7F
</commit_message>
<xml_diff>
--- a/p2/P2_Holiday_Program_Guide.docx
+++ b/p2/P2_Holiday_Program_Guide.docx
@@ -2848,7 +2848,7 @@
                 <w:sz w:val="20"/>
                 <w:szCs w:val="20"/>
               </w:rPr>
-              <w:t xml:space="preserve">0–10</w:t>
+              <w:t xml:space="preserve">0–8</w:t>
             </w:r>
           </w:p>
         </w:tc>
@@ -3022,7 +3022,7 @@
                 <w:sz w:val="20"/>
                 <w:szCs w:val="20"/>
               </w:rPr>
-              <w:t xml:space="preserve">10–25</w:t>
+              <w:t xml:space="preserve">8–20</w:t>
             </w:r>
           </w:p>
         </w:tc>
@@ -3196,7 +3196,7 @@
                 <w:sz w:val="20"/>
                 <w:szCs w:val="20"/>
               </w:rPr>
-              <w:t xml:space="preserve">25–35</w:t>
+              <w:t xml:space="preserve">20–32</w:t>
             </w:r>
           </w:p>
         </w:tc>
@@ -3370,7 +3370,7 @@
                 <w:sz w:val="20"/>
                 <w:szCs w:val="20"/>
               </w:rPr>
-              <w:t xml:space="preserve">35–40</w:t>
+              <w:t xml:space="preserve">32–36</w:t>
             </w:r>
           </w:p>
         </w:tc>
@@ -3544,7 +3544,7 @@
                 <w:sz w:val="20"/>
                 <w:szCs w:val="20"/>
               </w:rPr>
-              <w:t xml:space="preserve">40–70</w:t>
+              <w:t xml:space="preserve">36–72</w:t>
             </w:r>
           </w:p>
         </w:tc>
@@ -3612,7 +3612,7 @@
                 <w:sz w:val="20"/>
                 <w:szCs w:val="20"/>
               </w:rPr>
-              <w:t xml:space="preserve">Start in pairs, finish alone. Tutor asks “how do you know?” rather than giving answers.</w:t>
+              <w:t xml:space="preserve">Page 1 in pairs (36–50), check together (50–52), short teaching (52–57), page 2 alone (57–69), check together (69–72). Tutor asks “how do you know?” rather than giving answers.</w:t>
             </w:r>
           </w:p>
         </w:tc>
@@ -3718,7 +3718,7 @@
                 <w:sz w:val="20"/>
                 <w:szCs w:val="20"/>
               </w:rPr>
-              <w:t xml:space="preserve">70–80</w:t>
+              <w:t xml:space="preserve">72–80</w:t>
             </w:r>
           </w:p>
         </w:tc>
@@ -4226,7 +4226,7 @@
           <w:sz w:val="21"/>
           <w:szCs w:val="21"/>
         </w:rPr>
-        <w:t xml:space="preserve">Cut-outs used: place-value and digit cards (Lessons 1, 2, 10), play coins and notes (Lesson 6), fraction strips (Lesson 7), paper clock and cube strips (Lesson 9).</w:t>
+        <w:t xml:space="preserve">Cut-outs used: place-value cards (Lessons 1, 2, 10), digit cards (Lessons 1 and 10), play coins and notes (Lesson 6), fraction strips (Lesson 7), cube nets and paper cube strips (Lesson 8), paper clock (Lesson 9).</w:t>
       </w:r>
     </w:p>
     <w:p>
@@ -5668,7 +5668,7 @@
                 <w:sz w:val="20"/>
                 <w:szCs w:val="20"/>
               </w:rPr>
-              <w:t xml:space="preserve">Paper circles (2 per child), scissors, about 12 linking cubes per child (or sugar cubes), printed cube nets, mini whiteboards.</w:t>
+              <w:t xml:space="preserve">Paper circles (2 per child), scissors, about 12 linking cubes per child (or sugar cubes), the cube-net cut-out page (nets A to F, near the back of the workbook), mini whiteboards.</w:t>
             </w:r>
           </w:p>
         </w:tc>
@@ -5701,7 +5701,7 @@
                 <w:sz w:val="20"/>
                 <w:szCs w:val="20"/>
               </w:rPr>
-              <w:t xml:space="preserve">Children cut circles and build stacks on camera; nets are printed from the back of the workbook, or cut from an empty box.</w:t>
+              <w:t xml:space="preserve">Children cut circles and build stacks on camera; the six nets A to F are on a cut-out page near the back of the workbook (print and cut them before the lesson), or cut a net from an empty box.</w:t>
             </w:r>
           </w:p>
         </w:tc>
@@ -5807,7 +5807,7 @@
                 <w:sz w:val="20"/>
                 <w:szCs w:val="20"/>
               </w:rPr>
-              <w:t xml:space="preserve">A coat hanger, two paper cups and string (a home-made balance), 20¢ coins or erasers, a glue stick and a spoon; two plastic cups for pouring; a cardboard clock with hands; mini whiteboards.</w:t>
+              <w:t xml:space="preserve">A coat hanger, two paper cups, string, a glue stick, a spoon and about 20 20¢ coins (a home-made balance; backup: a ruler balanced on a pencil); for the jug puzzles two cups or bottles of different size (about 3 and 5 units), a jug of dry rice or sand (or water), and tape marking 3 and 5 units; a cardboard clock with hands; mini whiteboards.</w:t>
             </w:r>
           </w:p>
         </w:tc>
@@ -5840,7 +5840,7 @@
                 <w:sz w:val="20"/>
                 <w:szCs w:val="20"/>
               </w:rPr>
-              <w:t xml:space="preserve">Children build the coat-hanger balance before the lesson and hold it up to the camera. The tutor shares the slide balances, jugs and clocks and annotates on screen. Each child needs a cardboard or paper-plate clock.</w:t>
+              <w:t xml:space="preserve">Children build the coat-hanger balance before the lesson and hold it up to the camera. The tutor shares the slide balances, jugs and clocks and annotates on screen. Each child needs a cardboard or paper-plate clock. For the pouring puzzles use dry rice or sand rather than water when online, and let children act out each pour with the two containers.</w:t>
             </w:r>
           </w:p>
         </w:tc>
@@ -5946,7 +5946,7 @@
                 <w:sz w:val="20"/>
                 <w:szCs w:val="20"/>
               </w:rPr>
-              <w:t xml:space="preserve">Puzzle cards for 4 stations, play coins, digit cards 0 to 9, paper strips for fractions, mini whiteboards, certificates, stamps.</w:t>
+              <w:t xml:space="preserve">Four station cards (one slide each in the deck, and printed in the tutor guide), play coins, digit cards 0 to 9, paper strips for fractions, mini whiteboards, certificates, stamps.</w:t>
             </w:r>
           </w:p>
         </w:tc>
@@ -5979,7 +5979,7 @@
                 <w:sz w:val="20"/>
                 <w:szCs w:val="20"/>
               </w:rPr>
-              <w:t xml:space="preserve">Breakout pairs work on one station card each and report back to the group. Each child needs digit cards (cut from paper), a pencil and a mini whiteboard.</w:t>
+              <w:t xml:space="preserve">Each breakout pair gets one station card (the tutor pastes its text into the breakout room chat), works for 3 minutes, then swaps with another pair for a second card, and everyone reports back to the group. Each child needs digit cards (cut from paper), a pencil and a mini whiteboard.</w:t>
             </w:r>
           </w:p>
         </w:tc>
@@ -7437,7 +7437,7 @@
           <w:sz w:val="22"/>
           <w:szCs w:val="22"/>
         </w:rPr>
-        <w:t xml:space="preserve">2–10 min   </w:t>
+        <w:t xml:space="preserve">2–8 min   </w:t>
       </w:r>
       <w:r>
         <w:rPr>
@@ -8038,7 +8038,7 @@
           <w:sz w:val="22"/>
           <w:szCs w:val="22"/>
         </w:rPr>
-        <w:t xml:space="preserve">10–25 min   </w:t>
+        <w:t xml:space="preserve">8–20 min   </w:t>
       </w:r>
       <w:r>
         <w:rPr>
@@ -8313,7 +8313,7 @@
           <w:sz w:val="21"/>
           <w:szCs w:val="21"/>
         </w:rPr>
-        <w:t xml:space="preserve">At about minute 22, say “Pencils down” and bring the group back together. Take the three questions below, one at a time.</w:t>
+        <w:t xml:space="preserve">At about minute 14, say “Pencils down” and bring the group back together. Take the three questions below, one at a time (about 6 minutes).</w:t>
       </w:r>
     </w:p>
     <w:tbl>
@@ -8653,7 +8653,7 @@
           <w:sz w:val="22"/>
           <w:szCs w:val="22"/>
         </w:rPr>
-        <w:t xml:space="preserve">25–35 min   </w:t>
+        <w:t xml:space="preserve">20–32 min   </w:t>
       </w:r>
       <w:r>
         <w:rPr>
@@ -9078,7 +9078,7 @@
           <w:sz w:val="21"/>
           <w:szCs w:val="21"/>
         </w:rPr>
-        <w:t xml:space="preserve">Show the key idea slide at minutes 33 to 35. The “common mistakes” on that slide are for you, not the children. Watch for them during the worksheet:</w:t>
+        <w:t xml:space="preserve">Show the key idea slide at about minutes 31 to 32. The “common mistakes” on that slide are for you, not the children. Watch for them during the worksheet:</w:t>
       </w:r>
     </w:p>
     <w:p>
@@ -9166,7 +9166,7 @@
           <w:sz w:val="22"/>
           <w:szCs w:val="22"/>
         </w:rPr>
-        <w:t xml:space="preserve">35–40 min   </w:t>
+        <w:t xml:space="preserve">32–36 min   </w:t>
       </w:r>
       <w:r>
         <w:rPr>
@@ -9203,7 +9203,7 @@
           <w:sz w:val="21"/>
           <w:szCs w:val="21"/>
         </w:rPr>
-        <w:t xml:space="preserve">Human number. Three children stand as hundreds, tens and ones holding digit cards. Swap two of them: is the new number bigger or smaller?</w:t>
+        <w:t xml:space="preserve">Swap the digits. Each child puts three digit cards in a row (hundreds, tens, ones). The tutor calls “swap the hundreds and the tens” or “swap the tens and the ones”. Show your new number on camera. Is it bigger or smaller?</w:t>
       </w:r>
     </w:p>
     <w:p>
@@ -9229,7 +9229,7 @@
           <w:sz w:val="21"/>
           <w:szCs w:val="21"/>
         </w:rPr>
-        <w:t xml:space="preserve">Water. Toilet break for anyone who needs it. Keep it to five minutes.</w:t>
+        <w:t xml:space="preserve">Water. Toilet break for anyone who needs it. Keep it to four minutes.</w:t>
       </w:r>
     </w:p>
     <w:p>
@@ -9248,7 +9248,7 @@
           <w:sz w:val="22"/>
           <w:szCs w:val="22"/>
         </w:rPr>
-        <w:t xml:space="preserve">40–70 min   </w:t>
+        <w:t xml:space="preserve">36–72 min   </w:t>
       </w:r>
       <w:r>
         <w:rPr>
@@ -9285,7 +9285,7 @@
           <w:sz w:val="21"/>
           <w:szCs w:val="21"/>
         </w:rPr>
-        <w:t xml:space="preserve">Minute 40: give out the workbook. Read the title of Lesson 1 aloud. Say “Pairs first. Talk before you write.”</w:t>
+        <w:t xml:space="preserve">Minute 36: give out the workbook. Read the title of Lesson 1 aloud. Say “Pairs first. Talk before you write.”</w:t>
       </w:r>
     </w:p>
     <w:p>
@@ -9311,7 +9311,7 @@
           <w:sz w:val="21"/>
           <w:szCs w:val="21"/>
         </w:rPr>
-        <w:t xml:space="preserve">Minutes 40 to 52: pairs work together on the first page. Minutes 52 to 62: each child works alone on the second page. Minutes 62 to 70: stretch and challenge.</w:t>
+        <w:t xml:space="preserve">Minutes 36 to 50: pairs work together on the first page (in Lessons 5, 6 and 10 a short teach slide comes first, 36 to 38). Minutes 50 to 52: check page 1 together. Minutes 52 to 57: short teaching for page 2. Minutes 57 to 69: each child works alone on the second page. Minutes 69 to 72: check page 2 together. Stretch and challenge are for early finishers at any time after the first page.</w:t>
       </w:r>
     </w:p>
     <w:p>
@@ -10195,7 +10195,7 @@
           <w:sz w:val="22"/>
           <w:szCs w:val="22"/>
         </w:rPr>
-        <w:t xml:space="preserve">70–80 min   </w:t>
+        <w:t xml:space="preserve">72–80 min   </w:t>
       </w:r>
       <w:r>
         <w:rPr>
@@ -11550,7 +11550,7 @@
           <w:sz w:val="22"/>
           <w:szCs w:val="22"/>
         </w:rPr>
-        <w:t xml:space="preserve">2–10 min   </w:t>
+        <w:t xml:space="preserve">2–8 min   </w:t>
       </w:r>
       <w:r>
         <w:rPr>
@@ -12151,7 +12151,7 @@
           <w:sz w:val="22"/>
           <w:szCs w:val="22"/>
         </w:rPr>
-        <w:t xml:space="preserve">10–25 min   </w:t>
+        <w:t xml:space="preserve">8–20 min   </w:t>
       </w:r>
       <w:r>
         <w:rPr>
@@ -12426,7 +12426,7 @@
           <w:sz w:val="21"/>
           <w:szCs w:val="21"/>
         </w:rPr>
-        <w:t xml:space="preserve">At about minute 22, say “Pencils down” and bring the group back together. Take the three questions below, one at a time.</w:t>
+        <w:t xml:space="preserve">At about minute 14, say “Pencils down” and bring the group back together. Take the three questions below, one at a time (about 6 minutes).</w:t>
       </w:r>
     </w:p>
     <w:tbl>
@@ -12766,7 +12766,7 @@
           <w:sz w:val="22"/>
           <w:szCs w:val="22"/>
         </w:rPr>
-        <w:t xml:space="preserve">25–35 min   </w:t>
+        <w:t xml:space="preserve">20–32 min   </w:t>
       </w:r>
       <w:r>
         <w:rPr>
@@ -13219,7 +13219,7 @@
           <w:sz w:val="21"/>
           <w:szCs w:val="21"/>
         </w:rPr>
-        <w:t xml:space="preserve">Show the key idea slide at minutes 33 to 35. The “common mistakes” on that slide are for you, not the children. Watch for them during the worksheet:</w:t>
+        <w:t xml:space="preserve">Show the key idea slide at about minutes 31 to 32. The “common mistakes” on that slide are for you, not the children. Watch for them during the worksheet:</w:t>
       </w:r>
     </w:p>
     <w:p>
@@ -13307,7 +13307,7 @@
           <w:sz w:val="22"/>
           <w:szCs w:val="22"/>
         </w:rPr>
-        <w:t xml:space="preserve">35–40 min   </w:t>
+        <w:t xml:space="preserve">32–36 min   </w:t>
       </w:r>
       <w:r>
         <w:rPr>
@@ -13370,7 +13370,7 @@
           <w:sz w:val="21"/>
           <w:szCs w:val="21"/>
         </w:rPr>
-        <w:t xml:space="preserve">Water. Toilet break for anyone who needs it. Keep it to five minutes.</w:t>
+        <w:t xml:space="preserve">Water. Toilet break for anyone who needs it. Keep it to four minutes.</w:t>
       </w:r>
     </w:p>
     <w:p>
@@ -13389,7 +13389,7 @@
           <w:sz w:val="22"/>
           <w:szCs w:val="22"/>
         </w:rPr>
-        <w:t xml:space="preserve">40–70 min   </w:t>
+        <w:t xml:space="preserve">36–72 min   </w:t>
       </w:r>
       <w:r>
         <w:rPr>
@@ -13426,7 +13426,7 @@
           <w:sz w:val="21"/>
           <w:szCs w:val="21"/>
         </w:rPr>
-        <w:t xml:space="preserve">Minute 40: give out the workbook. Read the title of Lesson 2 aloud. Say “Pairs first. Talk before you write.”</w:t>
+        <w:t xml:space="preserve">Minute 36: give out the workbook. Read the title of Lesson 2 aloud. Say “Pairs first. Talk before you write.”</w:t>
       </w:r>
     </w:p>
     <w:p>
@@ -13452,7 +13452,7 @@
           <w:sz w:val="21"/>
           <w:szCs w:val="21"/>
         </w:rPr>
-        <w:t xml:space="preserve">Minutes 40 to 52: pairs work together on the first page. Minutes 52 to 62: each child works alone on the second page. Minutes 62 to 70: stretch and challenge.</w:t>
+        <w:t xml:space="preserve">Minutes 36 to 50: pairs work together on the first page (in Lessons 5, 6 and 10 a short teach slide comes first, 36 to 38). Minutes 50 to 52: check page 1 together. Minutes 52 to 57: short teaching for page 2. Minutes 57 to 69: each child works alone on the second page. Minutes 69 to 72: check page 2 together. Stretch and challenge are for early finishers at any time after the first page.</w:t>
       </w:r>
     </w:p>
     <w:p>
@@ -14039,7 +14039,7 @@
                 <w:sz w:val="20"/>
                 <w:szCs w:val="20"/>
               </w:rPr>
-              <w:t xml:space="preserve">Workbook Think Harder 4: A shop had 905 eggs. It sold some in the morning and 280 in the afternoon. 345 eggs were left. How many eggs were sold in the morning?</w:t>
+              <w:t xml:space="preserve">Workbook Think Harder 4: A shop had 905 eggs. It sold some in the morning and 260 in the afternoon. 345 eggs were left. How many eggs were sold in the morning?</w:t>
             </w:r>
           </w:p>
         </w:tc>
@@ -14072,7 +14072,7 @@
                 <w:sz w:val="20"/>
                 <w:szCs w:val="20"/>
               </w:rPr>
-              <w:t xml:space="preserve">280. Work backwards: 345 + 280 = 625 eggs after the morning; 905 − 625 = 280.</w:t>
+              <w:t xml:space="preserve">300. Work backwards: 345 + 260 = 605 eggs after the morning sales; 905 − 605 = 300.</w:t>
             </w:r>
           </w:p>
         </w:tc>
@@ -14336,7 +14336,7 @@
           <w:sz w:val="22"/>
           <w:szCs w:val="22"/>
         </w:rPr>
-        <w:t xml:space="preserve">70–80 min   </w:t>
+        <w:t xml:space="preserve">72–80 min   </w:t>
       </w:r>
       <w:r>
         <w:rPr>
@@ -15691,7 +15691,7 @@
           <w:sz w:val="22"/>
           <w:szCs w:val="22"/>
         </w:rPr>
-        <w:t xml:space="preserve">2–10 min   </w:t>
+        <w:t xml:space="preserve">2–8 min   </w:t>
       </w:r>
       <w:r>
         <w:rPr>
@@ -16292,7 +16292,7 @@
           <w:sz w:val="22"/>
           <w:szCs w:val="22"/>
         </w:rPr>
-        <w:t xml:space="preserve">10–25 min   </w:t>
+        <w:t xml:space="preserve">8–20 min   </w:t>
       </w:r>
       <w:r>
         <w:rPr>
@@ -16567,7 +16567,7 @@
           <w:sz w:val="21"/>
           <w:szCs w:val="21"/>
         </w:rPr>
-        <w:t xml:space="preserve">At about minute 22, say “Pencils down” and bring the group back together. Take the three questions below, one at a time.</w:t>
+        <w:t xml:space="preserve">At about minute 14, say “Pencils down” and bring the group back together. Take the three questions below, one at a time (about 6 minutes).</w:t>
       </w:r>
     </w:p>
     <w:tbl>
@@ -16907,7 +16907,7 @@
           <w:sz w:val="22"/>
           <w:szCs w:val="22"/>
         </w:rPr>
-        <w:t xml:space="preserve">25–35 min   </w:t>
+        <w:t xml:space="preserve">20–32 min   </w:t>
       </w:r>
       <w:r>
         <w:rPr>
@@ -17332,7 +17332,7 @@
           <w:sz w:val="21"/>
           <w:szCs w:val="21"/>
         </w:rPr>
-        <w:t xml:space="preserve">Show the key idea slide at minutes 33 to 35. The “common mistakes” on that slide are for you, not the children. Watch for them during the worksheet:</w:t>
+        <w:t xml:space="preserve">Show the key idea slide at about minutes 31 to 32. The “common mistakes” on that slide are for you, not the children. Watch for them during the worksheet:</w:t>
       </w:r>
     </w:p>
     <w:p>
@@ -17420,7 +17420,7 @@
           <w:sz w:val="22"/>
           <w:szCs w:val="22"/>
         </w:rPr>
-        <w:t xml:space="preserve">35–40 min   </w:t>
+        <w:t xml:space="preserve">32–36 min   </w:t>
       </w:r>
       <w:r>
         <w:rPr>
@@ -17483,7 +17483,7 @@
           <w:sz w:val="21"/>
           <w:szCs w:val="21"/>
         </w:rPr>
-        <w:t xml:space="preserve">Water. Toilet break for anyone who needs it. Keep it to five minutes.</w:t>
+        <w:t xml:space="preserve">Water. Toilet break for anyone who needs it. Keep it to four minutes.</w:t>
       </w:r>
     </w:p>
     <w:p>
@@ -17502,7 +17502,7 @@
           <w:sz w:val="22"/>
           <w:szCs w:val="22"/>
         </w:rPr>
-        <w:t xml:space="preserve">40–70 min   </w:t>
+        <w:t xml:space="preserve">36–72 min   </w:t>
       </w:r>
       <w:r>
         <w:rPr>
@@ -17539,7 +17539,7 @@
           <w:sz w:val="21"/>
           <w:szCs w:val="21"/>
         </w:rPr>
-        <w:t xml:space="preserve">Minute 40: give out the workbook. Read the title of Lesson 3 aloud. Say “Pairs first. Talk before you write.”</w:t>
+        <w:t xml:space="preserve">Minute 36: give out the workbook. Read the title of Lesson 3 aloud. Say “Pairs first. Talk before you write.”</w:t>
       </w:r>
     </w:p>
     <w:p>
@@ -17565,7 +17565,7 @@
           <w:sz w:val="21"/>
           <w:szCs w:val="21"/>
         </w:rPr>
-        <w:t xml:space="preserve">Minutes 40 to 52: pairs work together on the first page. Minutes 52 to 62: each child works alone on the second page. Minutes 62 to 70: stretch and challenge.</w:t>
+        <w:t xml:space="preserve">Minutes 36 to 50: pairs work together on the first page (in Lessons 5, 6 and 10 a short teach slide comes first, 36 to 38). Minutes 50 to 52: check page 1 together. Minutes 52 to 57: short teaching for page 2. Minutes 57 to 69: each child works alone on the second page. Minutes 69 to 72: check page 2 together. Stretch and challenge are for early finishers at any time after the first page.</w:t>
       </w:r>
     </w:p>
     <w:p>
@@ -18449,7 +18449,7 @@
           <w:sz w:val="22"/>
           <w:szCs w:val="22"/>
         </w:rPr>
-        <w:t xml:space="preserve">70–80 min   </w:t>
+        <w:t xml:space="preserve">72–80 min   </w:t>
       </w:r>
       <w:r>
         <w:rPr>
@@ -19235,7 +19235,7 @@
           <w:sz w:val="20"/>
           <w:szCs w:val="20"/>
         </w:rPr>
-        <w:t xml:space="preserve">3 ways: 7 bicycles and 1 tricycle (14 + 3); 4 bicycles and 3 tricycles (8 + 9); 1 bicycle and 5 tricycles (2 + 15). We know these are all: 0, 2 or 4 tricycles leave an odd number of wheels, which bicycles cannot make, and 6 or more tricycles need 18 wheels or more.</w:t>
+        <w:t xml:space="preserve">3 ways: 7 bicycles and 1 tricycle (14 + 3); 4 bicycles and 3 tricycles (8 + 9); 1 bicycle and 5 tricycles (2 + 15). We know these are all: 0, 2 or 4 tricycles leave an odd number of wheels, which bicycles cannot make, and 6 or more tricycles need 18 wheels or more. Accept a child’s own wording at this level, for example: "I tried 0, 1, 2, 3, 4, 5 tricycles in order; 6 tricycles is already 18 wheels." The odd/even reason is a bonus.</w:t>
       </w:r>
     </w:p>
     <w:p>
@@ -19801,7 +19801,7 @@
           <w:sz w:val="22"/>
           <w:szCs w:val="22"/>
         </w:rPr>
-        <w:t xml:space="preserve">2–10 min   </w:t>
+        <w:t xml:space="preserve">2–8 min   </w:t>
       </w:r>
       <w:r>
         <w:rPr>
@@ -20402,7 +20402,7 @@
           <w:sz w:val="22"/>
           <w:szCs w:val="22"/>
         </w:rPr>
-        <w:t xml:space="preserve">10–25 min   </w:t>
+        <w:t xml:space="preserve">8–20 min   </w:t>
       </w:r>
       <w:r>
         <w:rPr>
@@ -20677,7 +20677,7 @@
           <w:sz w:val="21"/>
           <w:szCs w:val="21"/>
         </w:rPr>
-        <w:t xml:space="preserve">At about minute 22, say “Pencils down” and bring the group back together. Take the three questions below, one at a time.</w:t>
+        <w:t xml:space="preserve">At about minute 14, say “Pencils down” and bring the group back together. Take the three questions below, one at a time (about 6 minutes).</w:t>
       </w:r>
     </w:p>
     <w:tbl>
@@ -21017,7 +21017,7 @@
           <w:sz w:val="22"/>
           <w:szCs w:val="22"/>
         </w:rPr>
-        <w:t xml:space="preserve">25–35 min   </w:t>
+        <w:t xml:space="preserve">20–32 min   </w:t>
       </w:r>
       <w:r>
         <w:rPr>
@@ -21442,7 +21442,7 @@
           <w:sz w:val="21"/>
           <w:szCs w:val="21"/>
         </w:rPr>
-        <w:t xml:space="preserve">Show the key idea slide at minutes 33 to 35. The “common mistakes” on that slide are for you, not the children. Watch for them during the worksheet:</w:t>
+        <w:t xml:space="preserve">Show the key idea slide at about minutes 31 to 32. The “common mistakes” on that slide are for you, not the children. Watch for them during the worksheet:</w:t>
       </w:r>
     </w:p>
     <w:p>
@@ -21530,7 +21530,7 @@
           <w:sz w:val="22"/>
           <w:szCs w:val="22"/>
         </w:rPr>
-        <w:t xml:space="preserve">35–40 min   </w:t>
+        <w:t xml:space="preserve">32–36 min   </w:t>
       </w:r>
       <w:r>
         <w:rPr>
@@ -21593,7 +21593,7 @@
           <w:sz w:val="21"/>
           <w:szCs w:val="21"/>
         </w:rPr>
-        <w:t xml:space="preserve">Water. Toilet break for anyone who needs it. Keep it to five minutes.</w:t>
+        <w:t xml:space="preserve">Water. Toilet break for anyone who needs it. Keep it to four minutes.</w:t>
       </w:r>
     </w:p>
     <w:p>
@@ -21612,7 +21612,7 @@
           <w:sz w:val="22"/>
           <w:szCs w:val="22"/>
         </w:rPr>
-        <w:t xml:space="preserve">40–70 min   </w:t>
+        <w:t xml:space="preserve">36–72 min   </w:t>
       </w:r>
       <w:r>
         <w:rPr>
@@ -21649,7 +21649,7 @@
           <w:sz w:val="21"/>
           <w:szCs w:val="21"/>
         </w:rPr>
-        <w:t xml:space="preserve">Minute 40: give out the workbook. Read the title of Lesson 4 aloud. Say “Pairs first. Talk before you write.”</w:t>
+        <w:t xml:space="preserve">Minute 36: give out the workbook. Read the title of Lesson 4 aloud. Say “Pairs first. Talk before you write.”</w:t>
       </w:r>
     </w:p>
     <w:p>
@@ -21675,7 +21675,7 @@
           <w:sz w:val="21"/>
           <w:szCs w:val="21"/>
         </w:rPr>
-        <w:t xml:space="preserve">Minutes 40 to 52: pairs work together on the first page. Minutes 52 to 62: each child works alone on the second page. Minutes 62 to 70: stretch and challenge.</w:t>
+        <w:t xml:space="preserve">Minutes 36 to 50: pairs work together on the first page (in Lessons 5, 6 and 10 a short teach slide comes first, 36 to 38). Minutes 50 to 52: check page 1 together. Minutes 52 to 57: short teaching for page 2. Minutes 57 to 69: each child works alone on the second page. Minutes 69 to 72: check page 2 together. Stretch and challenge are for early finishers at any time after the first page.</w:t>
       </w:r>
     </w:p>
     <w:p>
@@ -22559,7 +22559,7 @@
           <w:sz w:val="22"/>
           <w:szCs w:val="22"/>
         </w:rPr>
-        <w:t xml:space="preserve">70–80 min   </w:t>
+        <w:t xml:space="preserve">72–80 min   </w:t>
       </w:r>
       <w:r>
         <w:rPr>
@@ -23320,7 +23320,7 @@
           <w:sz w:val="20"/>
           <w:szCs w:val="20"/>
         </w:rPr>
-        <w:t xml:space="preserve">Ali: 3, 6, 9, 12, 15, 18, 21, 24, 27, 30, 33, 36, 39. Mei: 4, 8, 12, 16, 20, 24, 28, 32, 36, 40. Both: 12, 24, 36. They go up by 12 each time.</w:t>
+        <w:t xml:space="preserve">Ali (12 numbers, ending at 36): 3, 6, 9, 12, 15, 18, 21, 24, 27, 30, 33, 36. Mei (9 numbers, ending at 36): 4, 8, 12, 16, 20, 24, 28, 32, 36. Both: 12, 24, 36. They go up by 12 each time.</w:t>
       </w:r>
     </w:p>
     <w:p>
@@ -23886,7 +23886,7 @@
           <w:sz w:val="22"/>
           <w:szCs w:val="22"/>
         </w:rPr>
-        <w:t xml:space="preserve">2–10 min   </w:t>
+        <w:t xml:space="preserve">2–8 min   </w:t>
       </w:r>
       <w:r>
         <w:rPr>
@@ -24487,7 +24487,7 @@
           <w:sz w:val="22"/>
           <w:szCs w:val="22"/>
         </w:rPr>
-        <w:t xml:space="preserve">10–25 min   </w:t>
+        <w:t xml:space="preserve">8–20 min   </w:t>
       </w:r>
       <w:r>
         <w:rPr>
@@ -24762,7 +24762,7 @@
           <w:sz w:val="21"/>
           <w:szCs w:val="21"/>
         </w:rPr>
-        <w:t xml:space="preserve">At about minute 22, say “Pencils down” and bring the group back together. Take the three questions below, one at a time.</w:t>
+        <w:t xml:space="preserve">At about minute 14, say “Pencils down” and bring the group back together. Take the three questions below, one at a time (about 6 minutes).</w:t>
       </w:r>
     </w:p>
     <w:tbl>
@@ -25102,7 +25102,7 @@
           <w:sz w:val="22"/>
           <w:szCs w:val="22"/>
         </w:rPr>
-        <w:t xml:space="preserve">25–35 min   </w:t>
+        <w:t xml:space="preserve">20–32 min   </w:t>
       </w:r>
       <w:r>
         <w:rPr>
@@ -25527,7 +25527,7 @@
           <w:sz w:val="21"/>
           <w:szCs w:val="21"/>
         </w:rPr>
-        <w:t xml:space="preserve">Show the key idea slide at minutes 33 to 35. The “common mistakes” on that slide are for you, not the children. Watch for them during the worksheet:</w:t>
+        <w:t xml:space="preserve">Show the key idea slide at about minutes 31 to 32. The “common mistakes” on that slide are for you, not the children. Watch for them during the worksheet:</w:t>
       </w:r>
     </w:p>
     <w:p>
@@ -25615,7 +25615,7 @@
           <w:sz w:val="22"/>
           <w:szCs w:val="22"/>
         </w:rPr>
-        <w:t xml:space="preserve">35–40 min   </w:t>
+        <w:t xml:space="preserve">32–36 min   </w:t>
       </w:r>
       <w:r>
         <w:rPr>
@@ -25678,7 +25678,7 @@
           <w:sz w:val="21"/>
           <w:szCs w:val="21"/>
         </w:rPr>
-        <w:t xml:space="preserve">Water. Toilet break for anyone who needs it. Keep it to five minutes.</w:t>
+        <w:t xml:space="preserve">Water. Toilet break for anyone who needs it. Keep it to four minutes.</w:t>
       </w:r>
     </w:p>
     <w:p>
@@ -25697,7 +25697,7 @@
           <w:sz w:val="22"/>
           <w:szCs w:val="22"/>
         </w:rPr>
-        <w:t xml:space="preserve">40–70 min   </w:t>
+        <w:t xml:space="preserve">36–72 min   </w:t>
       </w:r>
       <w:r>
         <w:rPr>
@@ -25734,7 +25734,7 @@
           <w:sz w:val="21"/>
           <w:szCs w:val="21"/>
         </w:rPr>
-        <w:t xml:space="preserve">Minute 40: give out the workbook. Read the title of Lesson 5 aloud. Say “Pairs first. Talk before you write.”</w:t>
+        <w:t xml:space="preserve">Minute 36: give out the workbook. Read the title of Lesson 5 aloud. Say “Pairs first. Talk before you write.”</w:t>
       </w:r>
     </w:p>
     <w:p>
@@ -25760,7 +25760,7 @@
           <w:sz w:val="21"/>
           <w:szCs w:val="21"/>
         </w:rPr>
-        <w:t xml:space="preserve">Minutes 40 to 52: pairs work together on the first page. Minutes 52 to 62: each child works alone on the second page. Minutes 62 to 70: stretch and challenge.</w:t>
+        <w:t xml:space="preserve">Minutes 36 to 50: pairs work together on the first page (in Lessons 5, 6 and 10 a short teach slide comes first, 36 to 38). Minutes 50 to 52: check page 1 together. Minutes 52 to 57: short teaching for page 2. Minutes 57 to 69: each child works alone on the second page. Minutes 69 to 72: check page 2 together. Stretch and challenge are for early finishers at any time after the first page.</w:t>
       </w:r>
     </w:p>
     <w:p>
@@ -26347,7 +26347,7 @@
                 <w:sz w:val="20"/>
                 <w:szCs w:val="20"/>
               </w:rPr>
-              <w:t xml:space="preserve">Workbook Think Harder 4: A machine does × 2, then − 3. What goes IN to give OUT 17? What goes IN to give OUT 1?</w:t>
+              <w:t xml:space="preserve">Workbook Think Harder 4: Ali, Ben and Siti have 40 marbles altogether. Ben has 5 more marbles than Ali. Siti has 8 more marbles than Ali. How many marbles does each child have? Draw a bar for each child.</w:t>
             </w:r>
           </w:p>
         </w:tc>
@@ -26380,7 +26380,7 @@
                 <w:sz w:val="20"/>
                 <w:szCs w:val="20"/>
               </w:rPr>
-              <w:t xml:space="preserve">10, and 2 (17 + 3 = 20, 20 ÷ 2 = 10; 1 + 3 = 4, 4 ÷ 2 = 2)</w:t>
+              <w:t xml:space="preserve">Ali 9, Ben 14, Siti 17 (40 − 5 − 8 = 27, 27 ÷ 3 = 9; check 9 + 14 + 17 = 40)</w:t>
             </w:r>
           </w:p>
         </w:tc>
@@ -26644,7 +26644,7 @@
           <w:sz w:val="22"/>
           <w:szCs w:val="22"/>
         </w:rPr>
-        <w:t xml:space="preserve">70–80 min   </w:t>
+        <w:t xml:space="preserve">72–80 min   </w:t>
       </w:r>
       <w:r>
         <w:rPr>
@@ -27385,31 +27385,6 @@
     </w:p>
     <w:p>
       <w:pPr>
-        <w:keepLines/>
-        <w:spacing w:after="50" w:before="0" w:line="270" w:lineRule="auto"/>
-        <w:ind w:left="240"/>
-      </w:pPr>
-      <w:r>
-        <w:rPr>
-          <w:rFonts w:ascii="Arial" w:cs="Arial" w:eastAsia="Arial" w:hAnsi="Arial"/>
-          <w:b/>
-          <w:bCs/>
-          <w:sz w:val="20"/>
-          <w:szCs w:val="20"/>
-        </w:rPr>
-        <w:t xml:space="preserve">Q6  </w:t>
-      </w:r>
-      <w:r>
-        <w:rPr>
-          <w:rFonts w:ascii="Arial" w:cs="Arial" w:eastAsia="Arial" w:hAnsi="Arial"/>
-          <w:sz w:val="20"/>
-          <w:szCs w:val="20"/>
-        </w:rPr>
-        <w:t xml:space="preserve">Ali 9, Ben 14, Siti 17 (40 − 5 − 8 = 27, 27 ÷ 3 = 9; check 9 + 14 + 17 = 40)</w:t>
-      </w:r>
-    </w:p>
-    <w:p>
-      <w:pPr>
         <w:keepNext/>
         <w:keepLines/>
         <w:pageBreakBefore/>
@@ -27971,7 +27946,7 @@
           <w:sz w:val="22"/>
           <w:szCs w:val="22"/>
         </w:rPr>
-        <w:t xml:space="preserve">2–10 min   </w:t>
+        <w:t xml:space="preserve">2–8 min   </w:t>
       </w:r>
       <w:r>
         <w:rPr>
@@ -28503,7 +28478,7 @@
                 <w:sz w:val="20"/>
                 <w:szCs w:val="20"/>
               </w:rPr>
-              <w:t xml:space="preserve">You have $4.60. The book costs $5. How much more do you need?</w:t>
+              <w:t xml:space="preserve">You have 60¢. A sticker costs 85¢. How much more do you need?</w:t>
             </w:r>
           </w:p>
         </w:tc>
@@ -28536,7 +28511,7 @@
                 <w:sz w:val="20"/>
                 <w:szCs w:val="20"/>
               </w:rPr>
-              <w:t xml:space="preserve">40¢</w:t>
+              <w:t xml:space="preserve">25¢</w:t>
             </w:r>
           </w:p>
         </w:tc>
@@ -28572,7 +28547,7 @@
           <w:sz w:val="22"/>
           <w:szCs w:val="22"/>
         </w:rPr>
-        <w:t xml:space="preserve">10–25 min   </w:t>
+        <w:t xml:space="preserve">8–20 min   </w:t>
       </w:r>
       <w:r>
         <w:rPr>
@@ -28847,7 +28822,7 @@
           <w:sz w:val="21"/>
           <w:szCs w:val="21"/>
         </w:rPr>
-        <w:t xml:space="preserve">At about minute 22, say “Pencils down” and bring the group back together. Take the three questions below, one at a time.</w:t>
+        <w:t xml:space="preserve">At about minute 14, say “Pencils down” and bring the group back together. Take the three questions below, one at a time (about 6 minutes).</w:t>
       </w:r>
     </w:p>
     <w:tbl>
@@ -29187,7 +29162,7 @@
           <w:sz w:val="22"/>
           <w:szCs w:val="22"/>
         </w:rPr>
-        <w:t xml:space="preserve">25–35 min   </w:t>
+        <w:t xml:space="preserve">20–32 min   </w:t>
       </w:r>
       <w:r>
         <w:rPr>
@@ -29612,7 +29587,7 @@
           <w:sz w:val="21"/>
           <w:szCs w:val="21"/>
         </w:rPr>
-        <w:t xml:space="preserve">Show the key idea slide at minutes 33 to 35. The “common mistakes” on that slide are for you, not the children. Watch for them during the worksheet:</w:t>
+        <w:t xml:space="preserve">Show the key idea slide at about minutes 31 to 32. The “common mistakes” on that slide are for you, not the children. Watch for them during the worksheet:</w:t>
       </w:r>
     </w:p>
     <w:p>
@@ -29700,7 +29675,7 @@
           <w:sz w:val="22"/>
           <w:szCs w:val="22"/>
         </w:rPr>
-        <w:t xml:space="preserve">35–40 min   </w:t>
+        <w:t xml:space="preserve">32–36 min   </w:t>
       </w:r>
       <w:r>
         <w:rPr>
@@ -29763,7 +29738,7 @@
           <w:sz w:val="21"/>
           <w:szCs w:val="21"/>
         </w:rPr>
-        <w:t xml:space="preserve">Water. Toilet break for anyone who needs it. Keep it to five minutes.</w:t>
+        <w:t xml:space="preserve">Water. Toilet break for anyone who needs it. Keep it to four minutes.</w:t>
       </w:r>
     </w:p>
     <w:p>
@@ -29782,7 +29757,7 @@
           <w:sz w:val="22"/>
           <w:szCs w:val="22"/>
         </w:rPr>
-        <w:t xml:space="preserve">40–70 min   </w:t>
+        <w:t xml:space="preserve">36–72 min   </w:t>
       </w:r>
       <w:r>
         <w:rPr>
@@ -29819,7 +29794,7 @@
           <w:sz w:val="21"/>
           <w:szCs w:val="21"/>
         </w:rPr>
-        <w:t xml:space="preserve">Minute 40: give out the workbook. Read the title of Lesson 6 aloud. Say “Pairs first. Talk before you write.”</w:t>
+        <w:t xml:space="preserve">Minute 36: give out the workbook. Read the title of Lesson 6 aloud. Say “Pairs first. Talk before you write.”</w:t>
       </w:r>
     </w:p>
     <w:p>
@@ -29845,7 +29820,7 @@
           <w:sz w:val="21"/>
           <w:szCs w:val="21"/>
         </w:rPr>
-        <w:t xml:space="preserve">Minutes 40 to 52: pairs work together on the first page. Minutes 52 to 62: each child works alone on the second page. Minutes 62 to 70: stretch and challenge.</w:t>
+        <w:t xml:space="preserve">Minutes 36 to 50: pairs work together on the first page (in Lessons 5, 6 and 10 a short teach slide comes first, 36 to 38). Minutes 50 to 52: check page 1 together. Minutes 52 to 57: short teaching for page 2. Minutes 57 to 69: each child works alone on the second page. Minutes 69 to 72: check page 2 together. Stretch and challenge are for early finishers at any time after the first page.</w:t>
       </w:r>
     </w:p>
     <w:p>
@@ -30729,7 +30704,7 @@
           <w:sz w:val="22"/>
           <w:szCs w:val="22"/>
         </w:rPr>
-        <w:t xml:space="preserve">70–80 min   </w:t>
+        <w:t xml:space="preserve">72–80 min   </w:t>
       </w:r>
       <w:r>
         <w:rPr>
@@ -31390,7 +31365,7 @@
           <w:sz w:val="20"/>
           <w:szCs w:val="20"/>
         </w:rPr>
-        <w:t xml:space="preserve">7 ways ($5, $2, $1): 1,1,1 / 1,0,3 / 0,4,0 / 0,3,2 / 0,2,4 / 0,1,6 / 0,0,8. Row H is spare.  (a) 7 ways  (b) $5 + $1 + $1 + $1, and $2 + $2 + $2 + $2</w:t>
+        <w:t xml:space="preserve">7 ways ($5, $2, $1): 1,1,1 / 1,0,3 / 0,4,0 / 0,3,2 / 0,2,4 / 0,1,6 / 0,0,8. Row H is spare: tell children "you may not need every row".  (a) 7 ways  (b) $5 + $1 + $1 + $1, and $2 + $2 + $2 + $2</w:t>
       </w:r>
     </w:p>
     <w:p>
@@ -32056,7 +32031,7 @@
           <w:sz w:val="22"/>
           <w:szCs w:val="22"/>
         </w:rPr>
-        <w:t xml:space="preserve">2–10 min   </w:t>
+        <w:t xml:space="preserve">2–8 min   </w:t>
       </w:r>
       <w:r>
         <w:rPr>
@@ -32657,7 +32632,7 @@
           <w:sz w:val="22"/>
           <w:szCs w:val="22"/>
         </w:rPr>
-        <w:t xml:space="preserve">10–25 min   </w:t>
+        <w:t xml:space="preserve">8–20 min   </w:t>
       </w:r>
       <w:r>
         <w:rPr>
@@ -32932,7 +32907,7 @@
           <w:sz w:val="21"/>
           <w:szCs w:val="21"/>
         </w:rPr>
-        <w:t xml:space="preserve">At about minute 22, say “Pencils down” and bring the group back together. Take the three questions below, one at a time.</w:t>
+        <w:t xml:space="preserve">At about minute 14, say “Pencils down” and bring the group back together. Take the three questions below, one at a time (about 6 minutes).</w:t>
       </w:r>
     </w:p>
     <w:tbl>
@@ -33272,7 +33247,7 @@
           <w:sz w:val="22"/>
           <w:szCs w:val="22"/>
         </w:rPr>
-        <w:t xml:space="preserve">25–35 min   </w:t>
+        <w:t xml:space="preserve">20–32 min   </w:t>
       </w:r>
       <w:r>
         <w:rPr>
@@ -33697,7 +33672,7 @@
           <w:sz w:val="21"/>
           <w:szCs w:val="21"/>
         </w:rPr>
-        <w:t xml:space="preserve">Show the key idea slide at minutes 33 to 35. The “common mistakes” on that slide are for you, not the children. Watch for them during the worksheet:</w:t>
+        <w:t xml:space="preserve">Show the key idea slide at about minutes 31 to 32. The “common mistakes” on that slide are for you, not the children. Watch for them during the worksheet:</w:t>
       </w:r>
     </w:p>
     <w:p>
@@ -33785,7 +33760,7 @@
           <w:sz w:val="22"/>
           <w:szCs w:val="22"/>
         </w:rPr>
-        <w:t xml:space="preserve">35–40 min   </w:t>
+        <w:t xml:space="preserve">32–36 min   </w:t>
       </w:r>
       <w:r>
         <w:rPr>
@@ -33848,7 +33823,7 @@
           <w:sz w:val="21"/>
           <w:szCs w:val="21"/>
         </w:rPr>
-        <w:t xml:space="preserve">Water. Toilet break for anyone who needs it. Keep it to five minutes.</w:t>
+        <w:t xml:space="preserve">Water. Toilet break for anyone who needs it. Keep it to four minutes.</w:t>
       </w:r>
     </w:p>
     <w:p>
@@ -33867,7 +33842,7 @@
           <w:sz w:val="22"/>
           <w:szCs w:val="22"/>
         </w:rPr>
-        <w:t xml:space="preserve">40–70 min   </w:t>
+        <w:t xml:space="preserve">36–72 min   </w:t>
       </w:r>
       <w:r>
         <w:rPr>
@@ -33904,7 +33879,7 @@
           <w:sz w:val="21"/>
           <w:szCs w:val="21"/>
         </w:rPr>
-        <w:t xml:space="preserve">Minute 40: give out the workbook. Read the title of Lesson 7 aloud. Say “Pairs first. Talk before you write.”</w:t>
+        <w:t xml:space="preserve">Minute 36: give out the workbook. Read the title of Lesson 7 aloud. Say “Pairs first. Talk before you write.”</w:t>
       </w:r>
     </w:p>
     <w:p>
@@ -33930,7 +33905,7 @@
           <w:sz w:val="21"/>
           <w:szCs w:val="21"/>
         </w:rPr>
-        <w:t xml:space="preserve">Minutes 40 to 52: pairs work together on the first page. Minutes 52 to 62: each child works alone on the second page. Minutes 62 to 70: stretch and challenge.</w:t>
+        <w:t xml:space="preserve">Minutes 36 to 50: pairs work together on the first page (in Lessons 5, 6 and 10 a short teach slide comes first, 36 to 38). Minutes 50 to 52: check page 1 together. Minutes 52 to 57: short teaching for page 2. Minutes 57 to 69: each child works alone on the second page. Minutes 69 to 72: check page 2 together. Stretch and challenge are for early finishers at any time after the first page.</w:t>
       </w:r>
     </w:p>
     <w:p>
@@ -34814,7 +34789,7 @@
           <w:sz w:val="22"/>
           <w:szCs w:val="22"/>
         </w:rPr>
-        <w:t xml:space="preserve">70–80 min   </w:t>
+        <w:t xml:space="preserve">72–80 min   </w:t>
       </w:r>
       <w:r>
         <w:rPr>
@@ -35450,7 +35425,7 @@
           <w:sz w:val="20"/>
           <w:szCs w:val="20"/>
         </w:rPr>
-        <w:t xml:space="preserve">A, C, E and F are cut into quarters. (a) B or D: their 4 parts are not the same size, so a part is not a quarter.</w:t>
+        <w:t xml:space="preserve">A, C, E and F are cut into quarters. (a) B or D: their 4 parts are not the same size, so a part is not a quarter. F is the hardest: all four small triangles are the same size, even though the middle one is upside down.</w:t>
       </w:r>
     </w:p>
     <w:p>
@@ -35575,7 +35550,7 @@
           <w:sz w:val="20"/>
           <w:szCs w:val="20"/>
         </w:rPr>
-        <w:t xml:space="preserve">Siti. The pizzas are the same size and 1 quarter is the same as 2 eighths; 3 eighths is more than 2 eighths.</w:t>
+        <w:t xml:space="preserve">Siti. The pizzas are the same size and one quarter covers 2 eighths on the bars; 3 eighths is more than 2 eighths. (Equivalent fractions are a P3 topic: show this with bars only and do not write 1/4 = 2/8 as a rule.)</w:t>
       </w:r>
     </w:p>
     <w:p>
@@ -35845,7 +35820,7 @@
                 <w:sz w:val="20"/>
                 <w:szCs w:val="20"/>
               </w:rPr>
-              <w:t xml:space="preserve">Paper circles (2 per child), scissors, about 12 linking cubes per child (or sugar cubes), printed cube nets, mini whiteboards.</w:t>
+              <w:t xml:space="preserve">Paper circles (2 per child), scissors, about 12 linking cubes per child (or sugar cubes), the cube-net cut-out page (nets A to F, near the back of the workbook), mini whiteboards.</w:t>
             </w:r>
           </w:p>
         </w:tc>
@@ -35919,7 +35894,7 @@
                 <w:sz w:val="20"/>
                 <w:szCs w:val="20"/>
               </w:rPr>
-              <w:t xml:space="preserve">Children cut circles and build stacks on camera; nets are printed from the back of the workbook, or cut from an empty box.</w:t>
+              <w:t xml:space="preserve">Children cut circles and build stacks on camera; the six nets A to F are on a cut-out page near the back of the workbook (print and cut them before the lesson), or cut a net from an empty box.</w:t>
             </w:r>
           </w:p>
         </w:tc>
@@ -36141,7 +36116,7 @@
           <w:sz w:val="22"/>
           <w:szCs w:val="22"/>
         </w:rPr>
-        <w:t xml:space="preserve">2–10 min   </w:t>
+        <w:t xml:space="preserve">2–8 min   </w:t>
       </w:r>
       <w:r>
         <w:rPr>
@@ -36714,7 +36689,7 @@
           <w:sz w:val="22"/>
           <w:szCs w:val="22"/>
         </w:rPr>
-        <w:t xml:space="preserve">10–25 min   </w:t>
+        <w:t xml:space="preserve">8–20 min   </w:t>
       </w:r>
       <w:r>
         <w:rPr>
@@ -36989,7 +36964,7 @@
           <w:sz w:val="21"/>
           <w:szCs w:val="21"/>
         </w:rPr>
-        <w:t xml:space="preserve">At about minute 22, say “Pencils down” and bring the group back together. Take the three questions below, one at a time.</w:t>
+        <w:t xml:space="preserve">At about minute 14, say “Pencils down” and bring the group back together. Take the three questions below, one at a time (about 6 minutes).</w:t>
       </w:r>
     </w:p>
     <w:tbl>
@@ -37329,7 +37304,7 @@
           <w:sz w:val="22"/>
           <w:szCs w:val="22"/>
         </w:rPr>
-        <w:t xml:space="preserve">25–35 min   </w:t>
+        <w:t xml:space="preserve">20–32 min   </w:t>
       </w:r>
       <w:r>
         <w:rPr>
@@ -37754,7 +37729,7 @@
           <w:sz w:val="21"/>
           <w:szCs w:val="21"/>
         </w:rPr>
-        <w:t xml:space="preserve">Show the key idea slide at minutes 33 to 35. The “common mistakes” on that slide are for you, not the children. Watch for them during the worksheet:</w:t>
+        <w:t xml:space="preserve">Show the key idea slide at about minutes 31 to 32. The “common mistakes” on that slide are for you, not the children. Watch for them during the worksheet:</w:t>
       </w:r>
     </w:p>
     <w:p>
@@ -37823,7 +37798,7 @@
           <w:sz w:val="21"/>
           <w:szCs w:val="21"/>
         </w:rPr>
-        <w:t xml:space="preserve">Thinking any 6 joined squares fold into a cube (Q4): B, D and F do not.</w:t>
+        <w:t xml:space="preserve">Thinking any 6 joined squares fold into a cube (Q4): B, D and F do not (cutting out and folding shows why).</w:t>
       </w:r>
     </w:p>
     <w:p>
@@ -37842,7 +37817,7 @@
           <w:sz w:val="22"/>
           <w:szCs w:val="22"/>
         </w:rPr>
-        <w:t xml:space="preserve">35–40 min   </w:t>
+        <w:t xml:space="preserve">32–36 min   </w:t>
       </w:r>
       <w:r>
         <w:rPr>
@@ -37905,7 +37880,7 @@
           <w:sz w:val="21"/>
           <w:szCs w:val="21"/>
         </w:rPr>
-        <w:t xml:space="preserve">Water. Toilet break for anyone who needs it. Keep it to five minutes.</w:t>
+        <w:t xml:space="preserve">Water. Toilet break for anyone who needs it. Keep it to four minutes.</w:t>
       </w:r>
     </w:p>
     <w:p>
@@ -37924,7 +37899,7 @@
           <w:sz w:val="22"/>
           <w:szCs w:val="22"/>
         </w:rPr>
-        <w:t xml:space="preserve">40–70 min   </w:t>
+        <w:t xml:space="preserve">36–72 min   </w:t>
       </w:r>
       <w:r>
         <w:rPr>
@@ -37961,7 +37936,7 @@
           <w:sz w:val="21"/>
           <w:szCs w:val="21"/>
         </w:rPr>
-        <w:t xml:space="preserve">Minute 40: give out the workbook. Read the title of Lesson 8 aloud. Say “Pairs first. Talk before you write.”</w:t>
+        <w:t xml:space="preserve">Minute 36: give out the workbook. Read the title of Lesson 8 aloud. Say “Pairs first. Talk before you write.”</w:t>
       </w:r>
     </w:p>
     <w:p>
@@ -37987,7 +37962,7 @@
           <w:sz w:val="21"/>
           <w:szCs w:val="21"/>
         </w:rPr>
-        <w:t xml:space="preserve">Minutes 40 to 52: pairs work together on the first page. Minutes 52 to 62: each child works alone on the second page. Minutes 62 to 70: stretch and challenge.</w:t>
+        <w:t xml:space="preserve">Minutes 36 to 50: pairs work together on the first page (in Lessons 5, 6 and 10 a short teach slide comes first, 36 to 38). Minutes 50 to 52: check page 1 together. Minutes 52 to 57: short teaching for page 2. Minutes 57 to 69: each child works alone on the second page. Minutes 69 to 72: check page 2 together. Stretch and challenge are for early finishers at any time after the first page.</w:t>
       </w:r>
     </w:p>
     <w:p>
@@ -38871,7 +38846,7 @@
           <w:sz w:val="22"/>
           <w:szCs w:val="22"/>
         </w:rPr>
-        <w:t xml:space="preserve">70–80 min   </w:t>
+        <w:t xml:space="preserve">72–80 min   </w:t>
       </w:r>
       <w:r>
         <w:rPr>
@@ -39582,32 +39557,7 @@
           <w:sz w:val="20"/>
           <w:szCs w:val="20"/>
         </w:rPr>
-        <w:t xml:space="preserve">(a) A, C and E  (b) the new square goes under any one of the 4 squares in the row (4 possible places)</w:t>
-      </w:r>
-    </w:p>
-    <w:p>
-      <w:pPr>
-        <w:keepLines/>
-        <w:spacing w:after="50" w:before="0" w:line="270" w:lineRule="auto"/>
-        <w:ind w:left="240"/>
-      </w:pPr>
-      <w:r>
-        <w:rPr>
-          <w:rFonts w:ascii="Arial" w:cs="Arial" w:eastAsia="Arial" w:hAnsi="Arial"/>
-          <w:b/>
-          <w:bCs/>
-          <w:sz w:val="20"/>
-          <w:szCs w:val="20"/>
-        </w:rPr>
-        <w:t xml:space="preserve">Q5  </w:t>
-      </w:r>
-      <w:r>
-        <w:rPr>
-          <w:rFonts w:ascii="Arial" w:cs="Arial" w:eastAsia="Arial" w:hAnsi="Arial"/>
-          <w:sz w:val="20"/>
-          <w:szCs w:val="20"/>
-        </w:rPr>
-        <w:t xml:space="preserve">Row: 2, 3, 5, 4. Bottom square: 6. (1 and 6, 2 and 5, 3 and 4 are opposite.)</w:t>
+        <w:t xml:space="preserve">(a) A, C and E fold into a cube (children cut out and fold to check)  (b) the new square goes under any one of the 4 squares in the row (4 possible places)</w:t>
       </w:r>
     </w:p>
     <w:p>
@@ -39877,7 +39827,7 @@
                 <w:sz w:val="20"/>
                 <w:szCs w:val="20"/>
               </w:rPr>
-              <w:t xml:space="preserve">A coat hanger, two paper cups and string (a home-made balance), 20¢ coins or erasers, a glue stick and a spoon; two plastic cups for pouring; a cardboard clock with hands; mini whiteboards.</w:t>
+              <w:t xml:space="preserve">A coat hanger, two paper cups, string, a glue stick, a spoon and about 20 20¢ coins (a home-made balance; backup: a ruler balanced on a pencil); for the jug puzzles two cups or bottles of different size (about 3 and 5 units), a jug of dry rice or sand (or water), and tape marking 3 and 5 units; a cardboard clock with hands; mini whiteboards.</w:t>
             </w:r>
           </w:p>
         </w:tc>
@@ -39951,7 +39901,7 @@
                 <w:sz w:val="20"/>
                 <w:szCs w:val="20"/>
               </w:rPr>
-              <w:t xml:space="preserve">Children build the coat-hanger balance before the lesson and hold it up to the camera. The tutor shares the slide balances, jugs and clocks and annotates on screen. Each child needs a cardboard or paper-plate clock.</w:t>
+              <w:t xml:space="preserve">Children build the coat-hanger balance before the lesson and hold it up to the camera. The tutor shares the slide balances, jugs and clocks and annotates on screen. Each child needs a cardboard or paper-plate clock. For the pouring puzzles use dry rice or sand rather than water when online, and let children act out each pour with the two containers.</w:t>
             </w:r>
           </w:p>
         </w:tc>
@@ -40173,7 +40123,7 @@
           <w:sz w:val="22"/>
           <w:szCs w:val="22"/>
         </w:rPr>
-        <w:t xml:space="preserve">2–10 min   </w:t>
+        <w:t xml:space="preserve">2–8 min   </w:t>
       </w:r>
       <w:r>
         <w:rPr>
@@ -40774,7 +40724,7 @@
           <w:sz w:val="22"/>
           <w:szCs w:val="22"/>
         </w:rPr>
-        <w:t xml:space="preserve">10–25 min   </w:t>
+        <w:t xml:space="preserve">8–20 min   </w:t>
       </w:r>
       <w:r>
         <w:rPr>
@@ -41049,7 +40999,7 @@
           <w:sz w:val="21"/>
           <w:szCs w:val="21"/>
         </w:rPr>
-        <w:t xml:space="preserve">At about minute 22, say “Pencils down” and bring the group back together. Take the three questions below, one at a time.</w:t>
+        <w:t xml:space="preserve">At about minute 14, say “Pencils down” and bring the group back together. Take the three questions below, one at a time (about 6 minutes).</w:t>
       </w:r>
     </w:p>
     <w:tbl>
@@ -41389,7 +41339,7 @@
           <w:sz w:val="22"/>
           <w:szCs w:val="22"/>
         </w:rPr>
-        <w:t xml:space="preserve">25–35 min   </w:t>
+        <w:t xml:space="preserve">20–32 min   </w:t>
       </w:r>
       <w:r>
         <w:rPr>
@@ -41814,7 +41764,7 @@
           <w:sz w:val="21"/>
           <w:szCs w:val="21"/>
         </w:rPr>
-        <w:t xml:space="preserve">Show the key idea slide at minutes 33 to 35. The “common mistakes” on that slide are for you, not the children. Watch for them during the worksheet:</w:t>
+        <w:t xml:space="preserve">Show the key idea slide at about minutes 31 to 32. The “common mistakes” on that slide are for you, not the children. Watch for them during the worksheet:</w:t>
       </w:r>
     </w:p>
     <w:p>
@@ -41902,7 +41852,7 @@
           <w:sz w:val="22"/>
           <w:szCs w:val="22"/>
         </w:rPr>
-        <w:t xml:space="preserve">35–40 min   </w:t>
+        <w:t xml:space="preserve">32–36 min   </w:t>
       </w:r>
       <w:r>
         <w:rPr>
@@ -41965,7 +41915,7 @@
           <w:sz w:val="21"/>
           <w:szCs w:val="21"/>
         </w:rPr>
-        <w:t xml:space="preserve">Water. Toilet break for anyone who needs it. Keep it to five minutes.</w:t>
+        <w:t xml:space="preserve">Water. Toilet break for anyone who needs it. Keep it to four minutes.</w:t>
       </w:r>
     </w:p>
     <w:p>
@@ -41984,7 +41934,7 @@
           <w:sz w:val="22"/>
           <w:szCs w:val="22"/>
         </w:rPr>
-        <w:t xml:space="preserve">40–70 min   </w:t>
+        <w:t xml:space="preserve">36–72 min   </w:t>
       </w:r>
       <w:r>
         <w:rPr>
@@ -42021,7 +41971,7 @@
           <w:sz w:val="21"/>
           <w:szCs w:val="21"/>
         </w:rPr>
-        <w:t xml:space="preserve">Minute 40: give out the workbook. Read the title of Lesson 9 aloud. Say “Pairs first. Talk before you write.”</w:t>
+        <w:t xml:space="preserve">Minute 36: give out the workbook. Read the title of Lesson 9 aloud. Say “Pairs first. Talk before you write.”</w:t>
       </w:r>
     </w:p>
     <w:p>
@@ -42047,7 +41997,7 @@
           <w:sz w:val="21"/>
           <w:szCs w:val="21"/>
         </w:rPr>
-        <w:t xml:space="preserve">Minutes 40 to 52: pairs work together on the first page. Minutes 52 to 62: each child works alone on the second page. Minutes 62 to 70: stretch and challenge.</w:t>
+        <w:t xml:space="preserve">Minutes 36 to 50: pairs work together on the first page (in Lessons 5, 6 and 10 a short teach slide comes first, 36 to 38). Minutes 50 to 52: check page 1 together. Minutes 52 to 57: short teaching for page 2. Minutes 57 to 69: each child works alone on the second page. Minutes 69 to 72: check page 2 together. Stretch and challenge are for early finishers at any time after the first page.</w:t>
       </w:r>
     </w:p>
     <w:p>
@@ -42931,7 +42881,7 @@
           <w:sz w:val="22"/>
           <w:szCs w:val="22"/>
         </w:rPr>
-        <w:t xml:space="preserve">70–80 min   </w:t>
+        <w:t xml:space="preserve">72–80 min   </w:t>
       </w:r>
       <w:r>
         <w:rPr>
@@ -43993,7 +43943,7 @@
                 <w:sz w:val="20"/>
                 <w:szCs w:val="20"/>
               </w:rPr>
-              <w:t xml:space="preserve">Puzzle cards for 4 stations, play coins, digit cards 0 to 9, paper strips for fractions, mini whiteboards, certificates, stamps.</w:t>
+              <w:t xml:space="preserve">Four station cards (one slide each in the deck, and printed in the tutor guide), play coins, digit cards 0 to 9, paper strips for fractions, mini whiteboards, certificates, stamps.</w:t>
             </w:r>
           </w:p>
         </w:tc>
@@ -44067,7 +44017,7 @@
                 <w:sz w:val="20"/>
                 <w:szCs w:val="20"/>
               </w:rPr>
-              <w:t xml:space="preserve">Breakout pairs work on one station card each and report back to the group. Each child needs digit cards (cut from paper), a pencil and a mini whiteboard.</w:t>
+              <w:t xml:space="preserve">Each breakout pair gets one station card (the tutor pastes its text into the breakout room chat), works for 3 minutes, then swaps with another pair for a second card, and everyone reports back to the group. Each child needs digit cards (cut from paper), a pencil and a mini whiteboard.</w:t>
             </w:r>
           </w:p>
         </w:tc>
@@ -44289,7 +44239,7 @@
           <w:sz w:val="22"/>
           <w:szCs w:val="22"/>
         </w:rPr>
-        <w:t xml:space="preserve">2–10 min   </w:t>
+        <w:t xml:space="preserve">2–8 min   </w:t>
       </w:r>
       <w:r>
         <w:rPr>
@@ -44862,7 +44812,7 @@
           <w:sz w:val="22"/>
           <w:szCs w:val="22"/>
         </w:rPr>
-        <w:t xml:space="preserve">10–25 min   </w:t>
+        <w:t xml:space="preserve">8–20 min   </w:t>
       </w:r>
       <w:r>
         <w:rPr>
@@ -44927,7 +44877,7 @@
           <w:sz w:val="21"/>
           <w:szCs w:val="21"/>
         </w:rPr>
-        <w:t xml:space="preserve">1. Four station cards: a picture graph, a logic grid, a coin puzzle and a fraction strip.</w:t>
+        <w:t xml:space="preserve">1. Your pair gets one station card: a picture graph, a logic grid, a coin puzzle or a fraction strip.</w:t>
       </w:r>
     </w:p>
     <w:p>
@@ -44953,7 +44903,7 @@
           <w:sz w:val="21"/>
           <w:szCs w:val="21"/>
         </w:rPr>
-        <w:t xml:space="preserve">2. Work in pairs. Read the card aloud.</w:t>
+        <w:t xml:space="preserve">2. Read the card aloud. Before you solve it, write how you will start: draw, list or table.</w:t>
       </w:r>
     </w:p>
     <w:p>
@@ -44979,7 +44929,7 @@
           <w:sz w:val="21"/>
           <w:szCs w:val="21"/>
         </w:rPr>
-        <w:t xml:space="preserve">3. Before you solve it, write how you will start: draw, list or table.</w:t>
+        <w:t xml:space="preserve">3. Solve it and check it (3 minutes). Then swap cards with another pair.</w:t>
       </w:r>
     </w:p>
     <w:p>
@@ -45005,7 +44955,7 @@
           <w:sz w:val="21"/>
           <w:szCs w:val="21"/>
         </w:rPr>
-        <w:t xml:space="preserve">4. Solve it, check it, and be ready to explain.</w:t>
+        <w:t xml:space="preserve">4. Be ready to explain how you started and how you know.</w:t>
       </w:r>
     </w:p>
     <w:p>
@@ -45137,7 +45087,7 @@
           <w:sz w:val="21"/>
           <w:szCs w:val="21"/>
         </w:rPr>
-        <w:t xml:space="preserve">At about minute 22, say “Pencils down” and bring the group back together. Take the three questions below, one at a time.</w:t>
+        <w:t xml:space="preserve">Station cards (each is also one slide in the deck). One card per breakout pair, about 3 minutes, then swap:</w:t>
       </w:r>
     </w:p>
     <w:tbl>
@@ -45192,7 +45142,7 @@
                 <w:sz w:val="20"/>
                 <w:szCs w:val="20"/>
               </w:rPr>
-              <w:t xml:space="preserve">Ask</w:t>
+              <w:t xml:space="preserve">Station card</w:t>
             </w:r>
           </w:p>
         </w:tc>
@@ -45228,7 +45178,7 @@
                 <w:sz w:val="20"/>
                 <w:szCs w:val="20"/>
               </w:rPr>
-              <w:t xml:space="preserve">Expect</w:t>
+              <w:t xml:space="preserve">Answer</w:t>
             </w:r>
           </w:p>
         </w:tc>
@@ -45266,7 +45216,7 @@
                 <w:sz w:val="20"/>
                 <w:szCs w:val="20"/>
               </w:rPr>
-              <w:t xml:space="preserve">How did you start each card?</w:t>
+              <w:t xml:space="preserve">Card 1: picture graph. Each ● stands for 5 books. Monday ●●●, Tuesday ●●●●●, Wednesday ●●. How many books were read on these 3 days?</w:t>
             </w:r>
           </w:p>
         </w:tc>
@@ -45299,7 +45249,7 @@
                 <w:sz w:val="20"/>
                 <w:szCs w:val="20"/>
               </w:rPr>
-              <w:t xml:space="preserve">Open answers. Draw it, list it, or make a table.</w:t>
+              <w:t xml:space="preserve">50 books (10 pictures × 5)</w:t>
             </w:r>
           </w:p>
         </w:tc>
@@ -45337,7 +45287,7 @@
                 <w:sz w:val="20"/>
                 <w:szCs w:val="20"/>
               </w:rPr>
-              <w:t xml:space="preserve">Which card was hardest? Why?</w:t>
+              <w:t xml:space="preserve">Card 2: logic grid. Ali, Ben and Cai each have one pet: a cat, a dog or a fish. Ben has the fish. Ali does not have the dog. Who has the cat?</w:t>
             </w:r>
           </w:p>
         </w:tc>
@@ -45370,7 +45320,7 @@
                 <w:sz w:val="20"/>
                 <w:szCs w:val="20"/>
               </w:rPr>
-              <w:t xml:space="preserve">Open answers.</w:t>
+              <w:t xml:space="preserve">Ali has the cat (Ben has the fish, so Ali and Cai share the cat and the dog; Ali does not have the dog, so Ali has the cat and Cai has the dog)</w:t>
             </w:r>
           </w:p>
         </w:tc>
@@ -45408,7 +45358,7 @@
                 <w:sz w:val="20"/>
                 <w:szCs w:val="20"/>
               </w:rPr>
-              <w:t xml:space="preserve">What helped when you were stuck?</w:t>
+              <w:t xml:space="preserve">Card 3: coin puzzle. Make 70¢ with exactly 4 coins. You can use 5¢, 10¢, 20¢ and 50¢ coins. Find all the ways.</w:t>
             </w:r>
           </w:p>
         </w:tc>
@@ -45441,7 +45391,78 @@
                 <w:sz w:val="20"/>
                 <w:szCs w:val="20"/>
               </w:rPr>
-              <w:t xml:space="preserve">Drawing it, going in order, trying small numbers first, checking with the clues.</w:t>
+              <w:t xml:space="preserve">2 ways: 50¢ + 10¢ + 5¢ + 5¢, and 20¢ + 20¢ + 20¢ + 10¢</w:t>
+            </w:r>
+          </w:p>
+        </w:tc>
+      </w:tr>
+      <w:tr>
+        <w:trPr>
+          <w:cantSplit/>
+        </w:trPr>
+        <w:tc>
+          <w:tcPr>
+            <w:tcW w:type="dxa" w:w="4600"/>
+            <w:tcBorders>
+              <w:top w:val="single" w:color="000000" w:sz="8"/>
+              <w:left w:val="single" w:color="000000" w:sz="8"/>
+              <w:bottom w:val="single" w:color="000000" w:sz="8"/>
+              <w:right w:val="single" w:color="000000" w:sz="8"/>
+            </w:tcBorders>
+            <w:tcMar>
+              <w:top w:type="dxa" w:w="70"/>
+              <w:left w:type="dxa" w:w="100"/>
+              <w:bottom w:type="dxa" w:w="70"/>
+              <w:right w:type="dxa" w:w="100"/>
+            </w:tcMar>
+            <w:vAlign w:val="center"/>
+          </w:tcPr>
+          <w:p>
+            <w:pPr>
+              <w:keepLines/>
+              <w:spacing w:after="0" w:before="0" w:line="320" w:lineRule="auto"/>
+              <w:jc w:val="left"/>
+            </w:pPr>
+            <w:r>
+              <w:rPr>
+                <w:rFonts w:ascii="Arial" w:cs="Arial" w:eastAsia="Arial" w:hAnsi="Arial"/>
+                <w:sz w:val="20"/>
+                <w:szCs w:val="20"/>
+              </w:rPr>
+              <w:t xml:space="preserve">Card 4: fraction strip. A strip is cut into 8 equal parts. 3 parts are red and 2 parts are blue. What fraction is NOT coloured?</w:t>
+            </w:r>
+          </w:p>
+        </w:tc>
+        <w:tc>
+          <w:tcPr>
+            <w:tcW w:type="dxa" w:w="5300"/>
+            <w:tcBorders>
+              <w:top w:val="single" w:color="000000" w:sz="8"/>
+              <w:left w:val="single" w:color="000000" w:sz="8"/>
+              <w:bottom w:val="single" w:color="000000" w:sz="8"/>
+              <w:right w:val="single" w:color="000000" w:sz="8"/>
+            </w:tcBorders>
+            <w:tcMar>
+              <w:top w:type="dxa" w:w="70"/>
+              <w:left w:type="dxa" w:w="100"/>
+              <w:bottom w:type="dxa" w:w="70"/>
+              <w:right w:type="dxa" w:w="100"/>
+            </w:tcMar>
+            <w:vAlign w:val="center"/>
+          </w:tcPr>
+          <w:p>
+            <w:pPr>
+              <w:keepLines/>
+              <w:spacing w:after="0" w:before="0" w:line="320" w:lineRule="auto"/>
+              <w:jc w:val="left"/>
+            </w:pPr>
+            <w:r>
+              <w:rPr>
+                <w:rFonts w:ascii="Arial" w:cs="Arial" w:eastAsia="Arial" w:hAnsi="Arial"/>
+                <w:sz w:val="20"/>
+                <w:szCs w:val="20"/>
+              </w:rPr>
+              <w:t xml:space="preserve">3/8</w:t>
             </w:r>
           </w:p>
         </w:tc>
@@ -45459,36 +45480,6 @@
           <w:szCs w:val="26"/>
         </w:rPr>
         <w:t xml:space="preserve"/>
-      </w:r>
-    </w:p>
-    <w:p>
-      <w:pPr>
-        <w:keepNext/>
-        <w:keepLines/>
-        <w:shd w:fill="1F3864" w:color="auto" w:val="clear"/>
-        <w:spacing w:after="60" w:before="160" w:line="320" w:lineRule="auto"/>
-      </w:pPr>
-      <w:r>
-        <w:rPr>
-          <w:rFonts w:ascii="Arial" w:cs="Arial" w:eastAsia="Arial" w:hAnsi="Arial"/>
-          <w:b/>
-          <w:bCs/>
-          <w:color w:val="FFFFFF"/>
-          <w:sz w:val="22"/>
-          <w:szCs w:val="22"/>
-        </w:rPr>
-        <w:t xml:space="preserve">25–35 min   </w:t>
-      </w:r>
-      <w:r>
-        <w:rPr>
-          <w:rFonts w:ascii="Arial" w:cs="Arial" w:eastAsia="Arial" w:hAnsi="Arial"/>
-          <w:b/>
-          <w:bCs/>
-          <w:color w:val="FFFFFF"/>
-          <w:sz w:val="22"/>
-          <w:szCs w:val="22"/>
-        </w:rPr>
-        <w:t xml:space="preserve">Mini-lesson (you teach, they join in)</w:t>
       </w:r>
     </w:p>
     <w:p>
@@ -45514,91 +45505,7 @@
           <w:sz w:val="21"/>
           <w:szCs w:val="21"/>
         </w:rPr>
-        <w:t xml:space="preserve">Show the mini-lesson slides. Think aloud as you work. Say what you notice, what you test and how you check. Children copy how you think.</w:t>
-      </w:r>
-    </w:p>
-    <w:p>
-      <w:pPr>
-        <w:keepLines/>
-        <w:spacing w:after="50" w:before="0" w:line="280" w:lineRule="auto"/>
-        <w:ind w:left="900" w:hanging="900"/>
-      </w:pPr>
-      <w:r>
-        <w:rPr>
-          <w:rFonts w:ascii="Arial" w:cs="Arial" w:eastAsia="Arial" w:hAnsi="Arial"/>
-          <w:b/>
-          <w:bCs/>
-          <w:color w:val="1F6F5C"/>
-          <w:sz w:val="19"/>
-          <w:szCs w:val="19"/>
-        </w:rPr>
-        <w:t xml:space="preserve">SAY   </w:t>
-      </w:r>
-      <w:r>
-        <w:rPr>
-          <w:rFonts w:ascii="Arial" w:cs="Arial" w:eastAsia="Arial" w:hAnsi="Arial"/>
-          <w:i/>
-          <w:iCs/>
-          <w:sz w:val="21"/>
-          <w:szCs w:val="21"/>
-        </w:rPr>
-        <w:t xml:space="preserve">“Mei had some stickers. She gave half to Ben. Then she gave 6 to Siti and had 4 left. I cannot hold that in my head, so I draw a bar cut into two halves. One half went to Ben. The other half is the 6 for Siti and the 4 left: 6 + 4 = 10. Both halves are the same, so Mei had 10 + 10 = 20 stickers. Check: half of 20 is 10, 10 − 6 = 4 ✓.”</w:t>
-      </w:r>
-    </w:p>
-    <w:p>
-      <w:pPr>
-        <w:keepLines/>
-        <w:spacing w:after="50" w:before="0" w:line="280" w:lineRule="auto"/>
-        <w:ind w:left="900" w:hanging="900"/>
-      </w:pPr>
-      <w:r>
-        <w:rPr>
-          <w:rFonts w:ascii="Arial" w:cs="Arial" w:eastAsia="Arial" w:hAnsi="Arial"/>
-          <w:b/>
-          <w:bCs/>
-          <w:color w:val="1F6F5C"/>
-          <w:sz w:val="19"/>
-          <w:szCs w:val="19"/>
-        </w:rPr>
-        <w:t xml:space="preserve">          </w:t>
-      </w:r>
-      <w:r>
-        <w:rPr>
-          <w:rFonts w:ascii="Arial" w:cs="Arial" w:eastAsia="Arial" w:hAnsi="Arial"/>
-          <w:i/>
-          <w:iCs/>
-          <w:sz w:val="21"/>
-          <w:szCs w:val="21"/>
-        </w:rPr>
-        <w:t xml:space="preserve">“Digit cards 2, 0 and 5. How many 3-digit numbers? I list them in order, smallest hundreds digit first. 0 cannot go first. 2: 205, 250. 5: 502, 520. Four numbers, and I know I have them all because I went in order.”</w:t>
-      </w:r>
-    </w:p>
-    <w:p>
-      <w:pPr>
-        <w:keepLines/>
-        <w:spacing w:after="50" w:before="0" w:line="280" w:lineRule="auto"/>
-        <w:ind w:left="900" w:hanging="900"/>
-      </w:pPr>
-      <w:r>
-        <w:rPr>
-          <w:rFonts w:ascii="Arial" w:cs="Arial" w:eastAsia="Arial" w:hAnsi="Arial"/>
-          <w:b/>
-          <w:bCs/>
-          <w:color w:val="1F6F5C"/>
-          <w:sz w:val="19"/>
-          <w:szCs w:val="19"/>
-        </w:rPr>
-        <w:t xml:space="preserve">          </w:t>
-      </w:r>
-      <w:r>
-        <w:rPr>
-          <w:rFonts w:ascii="Arial" w:cs="Arial" w:eastAsia="Arial" w:hAnsi="Arial"/>
-          <w:i/>
-          <w:iCs/>
-          <w:sz w:val="21"/>
-          <w:szCs w:val="21"/>
-        </w:rPr>
-        <w:t xml:space="preserve">“Chickens and goats: 7 heads and 20 legs. I make a table. 0 goats: 14 legs. 1 goat: 16. 2 goats: 18. 3 goats: 20 ✓. So 3 goats and 4 chickens. Each goat I swap in adds 2 legs.”</w:t>
+        <w:t xml:space="preserve">At about minute 14, say “Pencils down” and bring the group back together. Take the three questions below, one at a time (about 6 minutes).</w:t>
       </w:r>
     </w:p>
     <w:tbl>
@@ -45653,7 +45560,7 @@
                 <w:sz w:val="20"/>
                 <w:szCs w:val="20"/>
               </w:rPr>
-              <w:t xml:space="preserve">Worked example on the slides</w:t>
+              <w:t xml:space="preserve">Ask</w:t>
             </w:r>
           </w:p>
         </w:tc>
@@ -45689,7 +45596,7 @@
                 <w:sz w:val="20"/>
                 <w:szCs w:val="20"/>
               </w:rPr>
-              <w:t xml:space="preserve">Answer</w:t>
+              <w:t xml:space="preserve">Expect</w:t>
             </w:r>
           </w:p>
         </w:tc>
@@ -45727,7 +45634,7 @@
                 <w:sz w:val="20"/>
                 <w:szCs w:val="20"/>
               </w:rPr>
-              <w:t xml:space="preserve">Draw it: a before-and-after story. Mei had some stickers. She gave half of them to Ben. Then she gave 6 to Siti. Now she has 4 left. How many stickers did she have at first?</w:t>
+              <w:t xml:space="preserve">How did you start each card?</w:t>
             </w:r>
           </w:p>
         </w:tc>
@@ -45760,7 +45667,7 @@
                 <w:sz w:val="20"/>
                 <w:szCs w:val="20"/>
               </w:rPr>
-              <w:t xml:space="preserve">20. The half she kept is 6 + 4 = 10, so she had 10 + 10 = 20. Check: 20 → 10 → 4.</w:t>
+              <w:t xml:space="preserve">Open answers. Draw it, list it, or make a table.</w:t>
             </w:r>
           </w:p>
         </w:tc>
@@ -45798,7 +45705,7 @@
                 <w:sz w:val="20"/>
                 <w:szCs w:val="20"/>
               </w:rPr>
-              <w:t xml:space="preserve">Make a table: heads and legs. A farm has chickens and goats. There are 7 heads and 20 legs. How many goats are there?</w:t>
+              <w:t xml:space="preserve">Which card was hardest? Why?</w:t>
             </w:r>
           </w:p>
         </w:tc>
@@ -45831,7 +45738,78 @@
                 <w:sz w:val="20"/>
                 <w:szCs w:val="20"/>
               </w:rPr>
-              <w:t xml:space="preserve">3 goats and 4 chickens. Table: 0 goats 14 legs, 1 goat 16, 2 goats 18, 3 goats 20 ✓. Check: 12 + 8 = 20.</w:t>
+              <w:t xml:space="preserve">Open answers.</w:t>
+            </w:r>
+          </w:p>
+        </w:tc>
+      </w:tr>
+      <w:tr>
+        <w:trPr>
+          <w:cantSplit/>
+        </w:trPr>
+        <w:tc>
+          <w:tcPr>
+            <w:tcW w:type="dxa" w:w="4600"/>
+            <w:tcBorders>
+              <w:top w:val="single" w:color="000000" w:sz="8"/>
+              <w:left w:val="single" w:color="000000" w:sz="8"/>
+              <w:bottom w:val="single" w:color="000000" w:sz="8"/>
+              <w:right w:val="single" w:color="000000" w:sz="8"/>
+            </w:tcBorders>
+            <w:tcMar>
+              <w:top w:type="dxa" w:w="70"/>
+              <w:left w:type="dxa" w:w="100"/>
+              <w:bottom w:type="dxa" w:w="70"/>
+              <w:right w:type="dxa" w:w="100"/>
+            </w:tcMar>
+            <w:vAlign w:val="center"/>
+          </w:tcPr>
+          <w:p>
+            <w:pPr>
+              <w:keepLines/>
+              <w:spacing w:after="0" w:before="0" w:line="320" w:lineRule="auto"/>
+              <w:jc w:val="left"/>
+            </w:pPr>
+            <w:r>
+              <w:rPr>
+                <w:rFonts w:ascii="Arial" w:cs="Arial" w:eastAsia="Arial" w:hAnsi="Arial"/>
+                <w:sz w:val="20"/>
+                <w:szCs w:val="20"/>
+              </w:rPr>
+              <w:t xml:space="preserve">What helped when you were stuck?</w:t>
+            </w:r>
+          </w:p>
+        </w:tc>
+        <w:tc>
+          <w:tcPr>
+            <w:tcW w:type="dxa" w:w="5300"/>
+            <w:tcBorders>
+              <w:top w:val="single" w:color="000000" w:sz="8"/>
+              <w:left w:val="single" w:color="000000" w:sz="8"/>
+              <w:bottom w:val="single" w:color="000000" w:sz="8"/>
+              <w:right w:val="single" w:color="000000" w:sz="8"/>
+            </w:tcBorders>
+            <w:tcMar>
+              <w:top w:type="dxa" w:w="70"/>
+              <w:left w:type="dxa" w:w="100"/>
+              <w:bottom w:type="dxa" w:w="70"/>
+              <w:right w:type="dxa" w:w="100"/>
+            </w:tcMar>
+            <w:vAlign w:val="center"/>
+          </w:tcPr>
+          <w:p>
+            <w:pPr>
+              <w:keepLines/>
+              <w:spacing w:after="0" w:before="0" w:line="320" w:lineRule="auto"/>
+              <w:jc w:val="left"/>
+            </w:pPr>
+            <w:r>
+              <w:rPr>
+                <w:rFonts w:ascii="Arial" w:cs="Arial" w:eastAsia="Arial" w:hAnsi="Arial"/>
+                <w:sz w:val="20"/>
+                <w:szCs w:val="20"/>
+              </w:rPr>
+              <w:t xml:space="preserve">Drawing it, going in order, trying small numbers first, checking with the clues.</w:t>
             </w:r>
           </w:p>
         </w:tc>
@@ -45849,6 +45827,62 @@
           <w:szCs w:val="26"/>
         </w:rPr>
         <w:t xml:space="preserve"/>
+      </w:r>
+    </w:p>
+    <w:p>
+      <w:pPr>
+        <w:keepNext/>
+        <w:keepLines/>
+        <w:shd w:fill="1F3864" w:color="auto" w:val="clear"/>
+        <w:spacing w:after="60" w:before="160" w:line="320" w:lineRule="auto"/>
+      </w:pPr>
+      <w:r>
+        <w:rPr>
+          <w:rFonts w:ascii="Arial" w:cs="Arial" w:eastAsia="Arial" w:hAnsi="Arial"/>
+          <w:b/>
+          <w:bCs/>
+          <w:color w:val="FFFFFF"/>
+          <w:sz w:val="22"/>
+          <w:szCs w:val="22"/>
+        </w:rPr>
+        <w:t xml:space="preserve">20–32 min   </w:t>
+      </w:r>
+      <w:r>
+        <w:rPr>
+          <w:rFonts w:ascii="Arial" w:cs="Arial" w:eastAsia="Arial" w:hAnsi="Arial"/>
+          <w:b/>
+          <w:bCs/>
+          <w:color w:val="FFFFFF"/>
+          <w:sz w:val="22"/>
+          <w:szCs w:val="22"/>
+        </w:rPr>
+        <w:t xml:space="preserve">Mini-lesson (you teach, they join in)</w:t>
+      </w:r>
+    </w:p>
+    <w:p>
+      <w:pPr>
+        <w:keepLines/>
+        <w:spacing w:after="40" w:before="0" w:line="280" w:lineRule="auto"/>
+        <w:ind w:left="900" w:hanging="900"/>
+      </w:pPr>
+      <w:r>
+        <w:rPr>
+          <w:rFonts w:ascii="Arial" w:cs="Arial" w:eastAsia="Arial" w:hAnsi="Arial"/>
+          <w:b/>
+          <w:bCs/>
+          <w:color w:val="7F6000"/>
+          <w:sz w:val="19"/>
+          <w:szCs w:val="19"/>
+        </w:rPr>
+        <w:t xml:space="preserve">DO     </w:t>
+      </w:r>
+      <w:r>
+        <w:rPr>
+          <w:rFonts w:ascii="Arial" w:cs="Arial" w:eastAsia="Arial" w:hAnsi="Arial"/>
+          <w:sz w:val="21"/>
+          <w:szCs w:val="21"/>
+        </w:rPr>
+        <w:t xml:space="preserve">Show the mini-lesson slides. Think aloud as you work. Say what you notice, what you test and how you check. Children copy how you think.</w:t>
       </w:r>
     </w:p>
     <w:p>
@@ -45876,266 +45910,7 @@
           <w:sz w:val="21"/>
           <w:szCs w:val="21"/>
         </w:rPr>
-        <w:t xml:space="preserve">“The key idea today is: how to start a puzzle. Stuck? Draw it, list it in order, or make a table. Say it with me.”</w:t>
-      </w:r>
-    </w:p>
-    <w:p>
-      <w:pPr>
-        <w:keepLines/>
-        <w:spacing w:after="40" w:before="0" w:line="280" w:lineRule="auto"/>
-        <w:ind w:left="900" w:hanging="900"/>
-      </w:pPr>
-      <w:r>
-        <w:rPr>
-          <w:rFonts w:ascii="Arial" w:cs="Arial" w:eastAsia="Arial" w:hAnsi="Arial"/>
-          <w:b/>
-          <w:bCs/>
-          <w:color w:val="7F6000"/>
-          <w:sz w:val="19"/>
-          <w:szCs w:val="19"/>
-        </w:rPr>
-        <w:t xml:space="preserve">DO     </w:t>
-      </w:r>
-      <w:r>
-        <w:rPr>
-          <w:rFonts w:ascii="Arial" w:cs="Arial" w:eastAsia="Arial" w:hAnsi="Arial"/>
-          <w:sz w:val="21"/>
-          <w:szCs w:val="21"/>
-        </w:rPr>
-        <w:t xml:space="preserve">Show the key idea slide at minutes 33 to 35. The “common mistakes” on that slide are for you, not the children. Watch for them during the worksheet:</w:t>
-      </w:r>
-    </w:p>
-    <w:p>
-      <w:pPr>
-        <w:keepLines/>
-        <w:spacing w:after="40" w:before="0" w:line="280" w:lineRule="auto"/>
-        <w:ind w:left="420" w:hanging="220"/>
-      </w:pPr>
-      <w:r>
-        <w:rPr>
-          <w:rFonts w:ascii="Arial" w:cs="Arial" w:eastAsia="Arial" w:hAnsi="Arial"/>
-          <w:sz w:val="21"/>
-          <w:szCs w:val="21"/>
-        </w:rPr>
-        <w:t xml:space="preserve">•  </w:t>
-      </w:r>
-      <w:r>
-        <w:rPr>
-          <w:rFonts w:ascii="Arial" w:cs="Arial" w:eastAsia="Arial" w:hAnsi="Arial"/>
-          <w:sz w:val="21"/>
-          <w:szCs w:val="21"/>
-        </w:rPr>
-        <w:t xml:space="preserve">Picture graph: counting the pictures instead of using the key (writing 6 instead of 30 for Tuesday).</w:t>
-      </w:r>
-    </w:p>
-    <w:p>
-      <w:pPr>
-        <w:keepLines/>
-        <w:spacing w:after="40" w:before="0" w:line="280" w:lineRule="auto"/>
-        <w:ind w:left="420" w:hanging="220"/>
-      </w:pPr>
-      <w:r>
-        <w:rPr>
-          <w:rFonts w:ascii="Arial" w:cs="Arial" w:eastAsia="Arial" w:hAnsi="Arial"/>
-          <w:sz w:val="21"/>
-          <w:szCs w:val="21"/>
-        </w:rPr>
-        <w:t xml:space="preserve">•  </w:t>
-      </w:r>
-      <w:r>
-        <w:rPr>
-          <w:rFonts w:ascii="Arial" w:cs="Arial" w:eastAsia="Arial" w:hAnsi="Arial"/>
-          <w:sz w:val="21"/>
-          <w:szCs w:val="21"/>
-        </w:rPr>
-        <w:t xml:space="preserve">Listing: putting 0 first (038 is not a 3-digit number) or missing a number because the list is not in order.</w:t>
-      </w:r>
-    </w:p>
-    <w:p>
-      <w:pPr>
-        <w:keepLines/>
-        <w:spacing w:after="40" w:before="0" w:line="280" w:lineRule="auto"/>
-        <w:ind w:left="420" w:hanging="220"/>
-      </w:pPr>
-      <w:r>
-        <w:rPr>
-          <w:rFonts w:ascii="Arial" w:cs="Arial" w:eastAsia="Arial" w:hAnsi="Arial"/>
-          <w:sz w:val="21"/>
-          <w:szCs w:val="21"/>
-        </w:rPr>
-        <w:t xml:space="preserve">•  </w:t>
-      </w:r>
-      <w:r>
-        <w:rPr>
-          <w:rFonts w:ascii="Arial" w:cs="Arial" w:eastAsia="Arial" w:hAnsi="Arial"/>
-          <w:sz w:val="21"/>
-          <w:szCs w:val="21"/>
-        </w:rPr>
-        <w:t xml:space="preserve">Logic grid: putting a tick without crossing out the rest of that row and column, so the next clue cannot be used.</w:t>
-      </w:r>
-    </w:p>
-    <w:p>
-      <w:pPr>
-        <w:keepNext/>
-        <w:keepLines/>
-        <w:shd w:fill="1F3864" w:color="auto" w:val="clear"/>
-        <w:spacing w:after="60" w:before="160" w:line="320" w:lineRule="auto"/>
-      </w:pPr>
-      <w:r>
-        <w:rPr>
-          <w:rFonts w:ascii="Arial" w:cs="Arial" w:eastAsia="Arial" w:hAnsi="Arial"/>
-          <w:b/>
-          <w:bCs/>
-          <w:color w:val="FFFFFF"/>
-          <w:sz w:val="22"/>
-          <w:szCs w:val="22"/>
-        </w:rPr>
-        <w:t xml:space="preserve">35–40 min   </w:t>
-      </w:r>
-      <w:r>
-        <w:rPr>
-          <w:rFonts w:ascii="Arial" w:cs="Arial" w:eastAsia="Arial" w:hAnsi="Arial"/>
-          <w:b/>
-          <w:bCs/>
-          <w:color w:val="FFFFFF"/>
-          <w:sz w:val="22"/>
-          <w:szCs w:val="22"/>
-        </w:rPr>
-        <w:t xml:space="preserve">Brain break</w:t>
-      </w:r>
-    </w:p>
-    <w:p>
-      <w:pPr>
-        <w:keepLines/>
-        <w:spacing w:after="40" w:before="0" w:line="280" w:lineRule="auto"/>
-        <w:ind w:left="900" w:hanging="900"/>
-      </w:pPr>
-      <w:r>
-        <w:rPr>
-          <w:rFonts w:ascii="Arial" w:cs="Arial" w:eastAsia="Arial" w:hAnsi="Arial"/>
-          <w:b/>
-          <w:bCs/>
-          <w:color w:val="7F6000"/>
-          <w:sz w:val="19"/>
-          <w:szCs w:val="19"/>
-        </w:rPr>
-        <w:t xml:space="preserve">DO     </w:t>
-      </w:r>
-      <w:r>
-        <w:rPr>
-          <w:rFonts w:ascii="Arial" w:cs="Arial" w:eastAsia="Arial" w:hAnsi="Arial"/>
-          <w:sz w:val="21"/>
-          <w:szCs w:val="21"/>
-        </w:rPr>
-        <w:t xml:space="preserve">Freeze with maths. Dance until the music stops, then make the shape the tutor calls with your arms: a semicircle, a quarter circle, a cone, a cuboid.</w:t>
-      </w:r>
-    </w:p>
-    <w:p>
-      <w:pPr>
-        <w:keepLines/>
-        <w:spacing w:after="40" w:before="0" w:line="280" w:lineRule="auto"/>
-        <w:ind w:left="900" w:hanging="900"/>
-      </w:pPr>
-      <w:r>
-        <w:rPr>
-          <w:rFonts w:ascii="Arial" w:cs="Arial" w:eastAsia="Arial" w:hAnsi="Arial"/>
-          <w:b/>
-          <w:bCs/>
-          <w:color w:val="7F6000"/>
-          <w:sz w:val="19"/>
-          <w:szCs w:val="19"/>
-        </w:rPr>
-        <w:t xml:space="preserve">          </w:t>
-      </w:r>
-      <w:r>
-        <w:rPr>
-          <w:rFonts w:ascii="Arial" w:cs="Arial" w:eastAsia="Arial" w:hAnsi="Arial"/>
-          <w:sz w:val="21"/>
-          <w:szCs w:val="21"/>
-        </w:rPr>
-        <w:t xml:space="preserve">Water. Toilet break for anyone who needs it. Keep it to five minutes.</w:t>
-      </w:r>
-    </w:p>
-    <w:p>
-      <w:pPr>
-        <w:keepNext/>
-        <w:keepLines/>
-        <w:shd w:fill="1F3864" w:color="auto" w:val="clear"/>
-        <w:spacing w:after="60" w:before="160" w:line="320" w:lineRule="auto"/>
-      </w:pPr>
-      <w:r>
-        <w:rPr>
-          <w:rFonts w:ascii="Arial" w:cs="Arial" w:eastAsia="Arial" w:hAnsi="Arial"/>
-          <w:b/>
-          <w:bCs/>
-          <w:color w:val="FFFFFF"/>
-          <w:sz w:val="22"/>
-          <w:szCs w:val="22"/>
-        </w:rPr>
-        <w:t xml:space="preserve">40–70 min   </w:t>
-      </w:r>
-      <w:r>
-        <w:rPr>
-          <w:rFonts w:ascii="Arial" w:cs="Arial" w:eastAsia="Arial" w:hAnsi="Arial"/>
-          <w:b/>
-          <w:bCs/>
-          <w:color w:val="FFFFFF"/>
-          <w:sz w:val="22"/>
-          <w:szCs w:val="22"/>
-        </w:rPr>
-        <w:t xml:space="preserve">Worksheet (pairs, then alone, then stretch)</w:t>
-      </w:r>
-    </w:p>
-    <w:p>
-      <w:pPr>
-        <w:keepLines/>
-        <w:spacing w:after="40" w:before="0" w:line="280" w:lineRule="auto"/>
-        <w:ind w:left="900" w:hanging="900"/>
-      </w:pPr>
-      <w:r>
-        <w:rPr>
-          <w:rFonts w:ascii="Arial" w:cs="Arial" w:eastAsia="Arial" w:hAnsi="Arial"/>
-          <w:b/>
-          <w:bCs/>
-          <w:color w:val="7F6000"/>
-          <w:sz w:val="19"/>
-          <w:szCs w:val="19"/>
-        </w:rPr>
-        <w:t xml:space="preserve">DO     </w:t>
-      </w:r>
-      <w:r>
-        <w:rPr>
-          <w:rFonts w:ascii="Arial" w:cs="Arial" w:eastAsia="Arial" w:hAnsi="Arial"/>
-          <w:sz w:val="21"/>
-          <w:szCs w:val="21"/>
-        </w:rPr>
-        <w:t xml:space="preserve">Minute 40: give out the workbook. Read the title of Lesson 10 aloud. Say “Pairs first. Talk before you write.”</w:t>
-      </w:r>
-    </w:p>
-    <w:p>
-      <w:pPr>
-        <w:keepLines/>
-        <w:spacing w:after="40" w:before="0" w:line="280" w:lineRule="auto"/>
-        <w:ind w:left="900" w:hanging="900"/>
-      </w:pPr>
-      <w:r>
-        <w:rPr>
-          <w:rFonts w:ascii="Arial" w:cs="Arial" w:eastAsia="Arial" w:hAnsi="Arial"/>
-          <w:b/>
-          <w:bCs/>
-          <w:color w:val="7F6000"/>
-          <w:sz w:val="19"/>
-          <w:szCs w:val="19"/>
-        </w:rPr>
-        <w:t xml:space="preserve">          </w:t>
-      </w:r>
-      <w:r>
-        <w:rPr>
-          <w:rFonts w:ascii="Arial" w:cs="Arial" w:eastAsia="Arial" w:hAnsi="Arial"/>
-          <w:sz w:val="21"/>
-          <w:szCs w:val="21"/>
-        </w:rPr>
-        <w:t xml:space="preserve">Minutes 40 to 52: pairs work together on the first page. Minutes 52 to 62: each child works alone on the second page. Minutes 62 to 70: stretch and challenge.</w:t>
+        <w:t xml:space="preserve">“Mei had some stickers. She gave half to Ben. Then she gave 6 to Siti and had 4 left. I cannot hold that in my head, so I draw a bar cut into two halves. One half went to Ben. The other half is the 6 for Siti and the 4 left: 6 + 4 = 10. Both halves are the same, so Mei had 10 + 10 = 20 stickers. Check: half of 20 is 10, 10 − 6 = 4 ✓.”</w:t>
       </w:r>
     </w:p>
     <w:p>
@@ -46153,7 +45928,7 @@
           <w:sz w:val="19"/>
           <w:szCs w:val="19"/>
         </w:rPr>
-        <w:t xml:space="preserve">SAY   </w:t>
+        <w:t xml:space="preserve">          </w:t>
       </w:r>
       <w:r>
         <w:rPr>
@@ -46163,13 +45938,13 @@
           <w:sz w:val="21"/>
           <w:szCs w:val="21"/>
         </w:rPr>
-        <w:t xml:space="preserve">“Pairs first. Read each question aloud and talk about it before you write. I am not looking for speed. I am looking for good thinking.”</w:t>
-      </w:r>
-    </w:p>
-    <w:p>
-      <w:pPr>
-        <w:keepLines/>
-        <w:spacing w:after="40" w:before="0" w:line="280" w:lineRule="auto"/>
+        <w:t xml:space="preserve">“Digit cards 2, 0 and 5. How many 3-digit numbers? I list them in order, smallest hundreds digit first. 0 cannot go first. 2: 205, 250. 5: 502, 520. Four numbers, and I know I have them all because I went in order.”</w:t>
+      </w:r>
+    </w:p>
+    <w:p>
+      <w:pPr>
+        <w:keepLines/>
+        <w:spacing w:after="50" w:before="0" w:line="280" w:lineRule="auto"/>
         <w:ind w:left="900" w:hanging="900"/>
       </w:pPr>
       <w:r>
@@ -46177,210 +45952,21 @@
           <w:rFonts w:ascii="Arial" w:cs="Arial" w:eastAsia="Arial" w:hAnsi="Arial"/>
           <w:b/>
           <w:bCs/>
-          <w:color w:val="7F6000"/>
+          <w:color w:val="1F6F5C"/>
           <w:sz w:val="19"/>
           <w:szCs w:val="19"/>
         </w:rPr>
-        <w:t xml:space="preserve">DO     </w:t>
-      </w:r>
-      <w:r>
-        <w:rPr>
-          <w:rFonts w:ascii="Arial" w:cs="Arial" w:eastAsia="Arial" w:hAnsi="Arial"/>
-          <w:sz w:val="21"/>
-          <w:szCs w:val="21"/>
-        </w:rPr>
-        <w:t xml:space="preserve">Circulate and ask:</w:t>
-      </w:r>
-    </w:p>
-    <w:p>
-      <w:pPr>
-        <w:keepLines/>
-        <w:spacing w:after="40" w:before="0" w:line="280" w:lineRule="auto"/>
-        <w:ind w:left="420" w:hanging="220"/>
-      </w:pPr>
-      <w:r>
-        <w:rPr>
-          <w:rFonts w:ascii="Arial" w:cs="Arial" w:eastAsia="Arial" w:hAnsi="Arial"/>
-          <w:sz w:val="21"/>
-          <w:szCs w:val="21"/>
-        </w:rPr>
-        <w:t xml:space="preserve">•  </w:t>
-      </w:r>
-      <w:r>
-        <w:rPr>
-          <w:rFonts w:ascii="Arial" w:cs="Arial" w:eastAsia="Arial" w:hAnsi="Arial"/>
-          <w:sz w:val="21"/>
-          <w:szCs w:val="21"/>
-        </w:rPr>
-        <w:t xml:space="preserve">Ask: “How did you start this one? Draw, list or table?”</w:t>
-      </w:r>
-    </w:p>
-    <w:p>
-      <w:pPr>
-        <w:keepLines/>
-        <w:spacing w:after="40" w:before="0" w:line="280" w:lineRule="auto"/>
-        <w:ind w:left="420" w:hanging="220"/>
-      </w:pPr>
-      <w:r>
-        <w:rPr>
-          <w:rFonts w:ascii="Arial" w:cs="Arial" w:eastAsia="Arial" w:hAnsi="Arial"/>
-          <w:sz w:val="21"/>
-          <w:szCs w:val="21"/>
-        </w:rPr>
-        <w:t xml:space="preserve">•  </w:t>
-      </w:r>
-      <w:r>
-        <w:rPr>
-          <w:rFonts w:ascii="Arial" w:cs="Arial" w:eastAsia="Arial" w:hAnsi="Arial"/>
-          <w:sz w:val="21"/>
-          <w:szCs w:val="21"/>
-        </w:rPr>
-        <w:t xml:space="preserve">Ask: “How do you know there is only one answer?”</w:t>
-      </w:r>
-    </w:p>
-    <w:p>
-      <w:pPr>
-        <w:keepLines/>
-        <w:spacing w:after="40" w:before="0" w:line="280" w:lineRule="auto"/>
-        <w:ind w:left="420" w:hanging="220"/>
-      </w:pPr>
-      <w:r>
-        <w:rPr>
-          <w:rFonts w:ascii="Arial" w:cs="Arial" w:eastAsia="Arial" w:hAnsi="Arial"/>
-          <w:sz w:val="21"/>
-          <w:szCs w:val="21"/>
-        </w:rPr>
-        <w:t xml:space="preserve">•  </w:t>
-      </w:r>
-      <w:r>
-        <w:rPr>
-          <w:rFonts w:ascii="Arial" w:cs="Arial" w:eastAsia="Arial" w:hAnsi="Arial"/>
-          <w:sz w:val="21"/>
-          <w:szCs w:val="21"/>
-        </w:rPr>
-        <w:t xml:space="preserve">Ask: “Show me your check.”</w:t>
-      </w:r>
-    </w:p>
-    <w:p>
-      <w:pPr>
-        <w:keepLines/>
-        <w:spacing w:after="40" w:before="0" w:line="280" w:lineRule="auto"/>
-        <w:ind w:left="1300" w:hanging="1300"/>
-      </w:pPr>
-      <w:r>
-        <w:rPr>
-          <w:rFonts w:ascii="Arial" w:cs="Arial" w:eastAsia="Arial" w:hAnsi="Arial"/>
-          <w:b/>
-          <w:bCs/>
-          <w:color w:val="A61C00"/>
-          <w:sz w:val="19"/>
-          <w:szCs w:val="19"/>
-        </w:rPr>
-        <w:t xml:space="preserve">IF STUCK   </w:t>
-      </w:r>
-      <w:r>
-        <w:rPr>
-          <w:rFonts w:ascii="Arial" w:cs="Arial" w:eastAsia="Arial" w:hAnsi="Arial"/>
-          <w:sz w:val="21"/>
-          <w:szCs w:val="21"/>
-        </w:rPr>
-        <w:t xml:space="preserve">Hint 1: “Which lesson does this remind you of?”</w:t>
-      </w:r>
-    </w:p>
-    <w:p>
-      <w:pPr>
-        <w:keepLines/>
-        <w:spacing w:after="40" w:before="0" w:line="280" w:lineRule="auto"/>
-        <w:ind w:left="1300" w:hanging="1300"/>
-      </w:pPr>
-      <w:r>
-        <w:rPr>
-          <w:rFonts w:ascii="Arial" w:cs="Arial" w:eastAsia="Arial" w:hAnsi="Arial"/>
-          <w:b/>
-          <w:bCs/>
-          <w:color w:val="A61C00"/>
-          <w:sz w:val="19"/>
-          <w:szCs w:val="19"/>
-        </w:rPr>
-        <w:t xml:space="preserve">                </w:t>
-      </w:r>
-      <w:r>
-        <w:rPr>
-          <w:rFonts w:ascii="Arial" w:cs="Arial" w:eastAsia="Arial" w:hAnsi="Arial"/>
-          <w:sz w:val="21"/>
-          <w:szCs w:val="21"/>
-        </w:rPr>
-        <w:t xml:space="preserve">Hint 2: “Draw it, list it in order, or make a table.”</w:t>
-      </w:r>
-    </w:p>
-    <w:p>
-      <w:pPr>
-        <w:keepLines/>
-        <w:spacing w:after="40" w:before="0" w:line="280" w:lineRule="auto"/>
-        <w:ind w:left="1300" w:hanging="1300"/>
-      </w:pPr>
-      <w:r>
-        <w:rPr>
-          <w:rFonts w:ascii="Arial" w:cs="Arial" w:eastAsia="Arial" w:hAnsi="Arial"/>
-          <w:b/>
-          <w:bCs/>
-          <w:color w:val="A61C00"/>
-          <w:sz w:val="19"/>
-          <w:szCs w:val="19"/>
-        </w:rPr>
-        <w:t xml:space="preserve">                </w:t>
-      </w:r>
-      <w:r>
-        <w:rPr>
-          <w:rFonts w:ascii="Arial" w:cs="Arial" w:eastAsia="Arial" w:hAnsi="Arial"/>
-          <w:sz w:val="21"/>
-          <w:szCs w:val="21"/>
-        </w:rPr>
-        <w:t xml:space="preserve">Hint 3: “Try a small number first, then change it one step at a time.”</w:t>
-      </w:r>
-    </w:p>
-    <w:p>
-      <w:pPr>
-        <w:keepLines/>
-        <w:spacing w:after="40" w:before="0" w:line="280" w:lineRule="auto"/>
-        <w:ind w:left="900" w:hanging="900"/>
-      </w:pPr>
-      <w:r>
-        <w:rPr>
-          <w:rFonts w:ascii="Arial" w:cs="Arial" w:eastAsia="Arial" w:hAnsi="Arial"/>
-          <w:b/>
-          <w:bCs/>
-          <w:color w:val="7F6000"/>
-          <w:sz w:val="19"/>
-          <w:szCs w:val="19"/>
-        </w:rPr>
-        <w:t xml:space="preserve">DO     </w:t>
-      </w:r>
-      <w:r>
-        <w:rPr>
-          <w:rFonts w:ascii="Arial" w:cs="Arial" w:eastAsia="Arial" w:hAnsi="Arial"/>
-          <w:sz w:val="21"/>
-          <w:szCs w:val="21"/>
-        </w:rPr>
-        <w:t xml:space="preserve">Early finishers: give the stretch question first, then the challenge.</w:t>
-      </w:r>
-    </w:p>
-    <w:p>
-      <w:pPr>
-        <w:keepNext/>
-        <w:keepLines/>
-        <w:spacing w:after="60" w:before="160" w:line="320" w:lineRule="auto"/>
-      </w:pPr>
-      <w:r>
-        <w:rPr>
-          <w:rFonts w:ascii="Arial" w:cs="Arial" w:eastAsia="Arial" w:hAnsi="Arial"/>
-          <w:b/>
-          <w:bCs/>
-          <w:color w:val="1F3864"/>
-          <w:sz w:val="24"/>
-          <w:szCs w:val="24"/>
-        </w:rPr>
-        <w:t xml:space="preserve">Stretch and challenge questions</w:t>
+        <w:t xml:space="preserve">          </w:t>
+      </w:r>
+      <w:r>
+        <w:rPr>
+          <w:rFonts w:ascii="Arial" w:cs="Arial" w:eastAsia="Arial" w:hAnsi="Arial"/>
+          <w:i/>
+          <w:iCs/>
+          <w:sz w:val="21"/>
+          <w:szCs w:val="21"/>
+        </w:rPr>
+        <w:t xml:space="preserve">“Chickens and goats: 7 heads and 20 legs. I make a table. 0 goats: 14 legs. 1 goat: 16. 2 goats: 18. 3 goats: 20 ✓. So 3 goats and 4 chickens. Each goat I swap in adds 2 legs.”</w:t>
       </w:r>
     </w:p>
     <w:tbl>
@@ -46435,7 +46021,7 @@
                 <w:sz w:val="20"/>
                 <w:szCs w:val="20"/>
               </w:rPr>
-              <w:t xml:space="preserve">Question</w:t>
+              <w:t xml:space="preserve">Worked example on the slides</w:t>
             </w:r>
           </w:p>
         </w:tc>
@@ -46509,7 +46095,7 @@
                 <w:sz w:val="20"/>
                 <w:szCs w:val="20"/>
               </w:rPr>
-              <w:t xml:space="preserve">Workbook Think Harder 1: 30 children chose a fruit. In the picture graph each ● stands for 5 children. Apple has ●● and banana has ●●●. The mango row is missing. How many ● should the mango row have?</w:t>
+              <w:t xml:space="preserve">Draw it: a before-and-after story. Mei had some stickers. She gave half of them to Ben. Then she gave 6 to Siti. Now she has 4 left. How many stickers did she have at first?</w:t>
             </w:r>
           </w:p>
         </w:tc>
@@ -46542,7 +46128,7 @@
                 <w:sz w:val="20"/>
                 <w:szCs w:val="20"/>
               </w:rPr>
-              <w:t xml:space="preserve">1 ● (apple 10, banana 15, so mango is 30 − 25 = 5 children)</w:t>
+              <w:t xml:space="preserve">20. The half she kept is 6 + 4 = 10, so she had 10 + 10 = 20. Check: 20 → 10 → 4.</w:t>
             </w:r>
           </w:p>
         </w:tc>
@@ -46580,7 +46166,7 @@
                 <w:sz w:val="20"/>
                 <w:szCs w:val="20"/>
               </w:rPr>
-              <w:t xml:space="preserve">Workbook Think Harder 2: How many 3-digit numbers have digits that add up to 3? List them all.</w:t>
+              <w:t xml:space="preserve">Make a table: heads and legs. A farm has chickens and goats. There are 7 heads and 20 legs. How many goats are there?</w:t>
             </w:r>
           </w:p>
         </w:tc>
@@ -46613,362 +46199,7 @@
                 <w:sz w:val="20"/>
                 <w:szCs w:val="20"/>
               </w:rPr>
-              <w:t xml:space="preserve">6: 102, 111, 120, 201, 210, 300</w:t>
-            </w:r>
-          </w:p>
-        </w:tc>
-      </w:tr>
-      <w:tr>
-        <w:trPr>
-          <w:cantSplit/>
-        </w:trPr>
-        <w:tc>
-          <w:tcPr>
-            <w:tcW w:type="dxa" w:w="4600"/>
-            <w:tcBorders>
-              <w:top w:val="single" w:color="000000" w:sz="8"/>
-              <w:left w:val="single" w:color="000000" w:sz="8"/>
-              <w:bottom w:val="single" w:color="000000" w:sz="8"/>
-              <w:right w:val="single" w:color="000000" w:sz="8"/>
-            </w:tcBorders>
-            <w:tcMar>
-              <w:top w:type="dxa" w:w="70"/>
-              <w:left w:type="dxa" w:w="100"/>
-              <w:bottom w:type="dxa" w:w="70"/>
-              <w:right w:type="dxa" w:w="100"/>
-            </w:tcMar>
-            <w:vAlign w:val="center"/>
-          </w:tcPr>
-          <w:p>
-            <w:pPr>
-              <w:keepLines/>
-              <w:spacing w:after="0" w:before="0" w:line="320" w:lineRule="auto"/>
-              <w:jc w:val="left"/>
-            </w:pPr>
-            <w:r>
-              <w:rPr>
-                <w:rFonts w:ascii="Arial" w:cs="Arial" w:eastAsia="Arial" w:hAnsi="Arial"/>
-                <w:sz w:val="20"/>
-                <w:szCs w:val="20"/>
-              </w:rPr>
-              <w:t xml:space="preserve">Workbook Think Harder 3: Ravi has 4 boxes of 5 pencils and 3 boxes of 10 pencils. He shares all the pencils equally among 5 friends. How many does each friend get?</w:t>
-            </w:r>
-          </w:p>
-        </w:tc>
-        <w:tc>
-          <w:tcPr>
-            <w:tcW w:type="dxa" w:w="5300"/>
-            <w:tcBorders>
-              <w:top w:val="single" w:color="000000" w:sz="8"/>
-              <w:left w:val="single" w:color="000000" w:sz="8"/>
-              <w:bottom w:val="single" w:color="000000" w:sz="8"/>
-              <w:right w:val="single" w:color="000000" w:sz="8"/>
-            </w:tcBorders>
-            <w:tcMar>
-              <w:top w:type="dxa" w:w="70"/>
-              <w:left w:type="dxa" w:w="100"/>
-              <w:bottom w:type="dxa" w:w="70"/>
-              <w:right w:type="dxa" w:w="100"/>
-            </w:tcMar>
-            <w:vAlign w:val="center"/>
-          </w:tcPr>
-          <w:p>
-            <w:pPr>
-              <w:keepLines/>
-              <w:spacing w:after="0" w:before="0" w:line="320" w:lineRule="auto"/>
-              <w:jc w:val="left"/>
-            </w:pPr>
-            <w:r>
-              <w:rPr>
-                <w:rFonts w:ascii="Arial" w:cs="Arial" w:eastAsia="Arial" w:hAnsi="Arial"/>
-                <w:sz w:val="20"/>
-                <w:szCs w:val="20"/>
-              </w:rPr>
-              <w:t xml:space="preserve">10 (20 + 30 = 50 pencils; 50 ÷ 5 = 10)</w:t>
-            </w:r>
-          </w:p>
-        </w:tc>
-      </w:tr>
-      <w:tr>
-        <w:trPr>
-          <w:cantSplit/>
-        </w:trPr>
-        <w:tc>
-          <w:tcPr>
-            <w:tcW w:type="dxa" w:w="4600"/>
-            <w:tcBorders>
-              <w:top w:val="single" w:color="000000" w:sz="8"/>
-              <w:left w:val="single" w:color="000000" w:sz="8"/>
-              <w:bottom w:val="single" w:color="000000" w:sz="8"/>
-              <w:right w:val="single" w:color="000000" w:sz="8"/>
-            </w:tcBorders>
-            <w:tcMar>
-              <w:top w:type="dxa" w:w="70"/>
-              <w:left w:type="dxa" w:w="100"/>
-              <w:bottom w:type="dxa" w:w="70"/>
-              <w:right w:type="dxa" w:w="100"/>
-            </w:tcMar>
-            <w:vAlign w:val="center"/>
-          </w:tcPr>
-          <w:p>
-            <w:pPr>
-              <w:keepLines/>
-              <w:spacing w:after="0" w:before="0" w:line="320" w:lineRule="auto"/>
-              <w:jc w:val="left"/>
-            </w:pPr>
-            <w:r>
-              <w:rPr>
-                <w:rFonts w:ascii="Arial" w:cs="Arial" w:eastAsia="Arial" w:hAnsi="Arial"/>
-                <w:sz w:val="20"/>
-                <w:szCs w:val="20"/>
-              </w:rPr>
-              <w:t xml:space="preserve">Workbook Think Harder 4: 5, 9, 13, 17, … What is the 10th number in this pattern?</w:t>
-            </w:r>
-          </w:p>
-        </w:tc>
-        <w:tc>
-          <w:tcPr>
-            <w:tcW w:type="dxa" w:w="5300"/>
-            <w:tcBorders>
-              <w:top w:val="single" w:color="000000" w:sz="8"/>
-              <w:left w:val="single" w:color="000000" w:sz="8"/>
-              <w:bottom w:val="single" w:color="000000" w:sz="8"/>
-              <w:right w:val="single" w:color="000000" w:sz="8"/>
-            </w:tcBorders>
-            <w:tcMar>
-              <w:top w:type="dxa" w:w="70"/>
-              <w:left w:type="dxa" w:w="100"/>
-              <w:bottom w:type="dxa" w:w="70"/>
-              <w:right w:type="dxa" w:w="100"/>
-            </w:tcMar>
-            <w:vAlign w:val="center"/>
-          </w:tcPr>
-          <w:p>
-            <w:pPr>
-              <w:keepLines/>
-              <w:spacing w:after="0" w:before="0" w:line="320" w:lineRule="auto"/>
-              <w:jc w:val="left"/>
-            </w:pPr>
-            <w:r>
-              <w:rPr>
-                <w:rFonts w:ascii="Arial" w:cs="Arial" w:eastAsia="Arial" w:hAnsi="Arial"/>
-                <w:sz w:val="20"/>
-                <w:szCs w:val="20"/>
-              </w:rPr>
-              <w:t xml:space="preserve">41 (add 4: 21, 25, 29, 33, 37, 41)</w:t>
-            </w:r>
-          </w:p>
-        </w:tc>
-      </w:tr>
-      <w:tr>
-        <w:trPr>
-          <w:cantSplit/>
-        </w:trPr>
-        <w:tc>
-          <w:tcPr>
-            <w:tcW w:type="dxa" w:w="4600"/>
-            <w:tcBorders>
-              <w:top w:val="single" w:color="000000" w:sz="8"/>
-              <w:left w:val="single" w:color="000000" w:sz="8"/>
-              <w:bottom w:val="single" w:color="000000" w:sz="8"/>
-              <w:right w:val="single" w:color="000000" w:sz="8"/>
-            </w:tcBorders>
-            <w:tcMar>
-              <w:top w:type="dxa" w:w="70"/>
-              <w:left w:type="dxa" w:w="100"/>
-              <w:bottom w:type="dxa" w:w="70"/>
-              <w:right w:type="dxa" w:w="100"/>
-            </w:tcMar>
-            <w:vAlign w:val="center"/>
-          </w:tcPr>
-          <w:p>
-            <w:pPr>
-              <w:keepLines/>
-              <w:spacing w:after="0" w:before="0" w:line="320" w:lineRule="auto"/>
-              <w:jc w:val="left"/>
-            </w:pPr>
-            <w:r>
-              <w:rPr>
-                <w:rFonts w:ascii="Arial" w:cs="Arial" w:eastAsia="Arial" w:hAnsi="Arial"/>
-                <w:sz w:val="20"/>
-                <w:szCs w:val="20"/>
-              </w:rPr>
-              <w:t xml:space="preserve">Workbook Challenge 5: A picture graph has lost its key. Football has 6 pictures and swimming has 4 pictures. 10 more children chose football than swimming. How many children chose swimming? Football?</w:t>
-            </w:r>
-          </w:p>
-        </w:tc>
-        <w:tc>
-          <w:tcPr>
-            <w:tcW w:type="dxa" w:w="5300"/>
-            <w:tcBorders>
-              <w:top w:val="single" w:color="000000" w:sz="8"/>
-              <w:left w:val="single" w:color="000000" w:sz="8"/>
-              <w:bottom w:val="single" w:color="000000" w:sz="8"/>
-              <w:right w:val="single" w:color="000000" w:sz="8"/>
-            </w:tcBorders>
-            <w:tcMar>
-              <w:top w:type="dxa" w:w="70"/>
-              <w:left w:type="dxa" w:w="100"/>
-              <w:bottom w:type="dxa" w:w="70"/>
-              <w:right w:type="dxa" w:w="100"/>
-            </w:tcMar>
-            <w:vAlign w:val="center"/>
-          </w:tcPr>
-          <w:p>
-            <w:pPr>
-              <w:keepLines/>
-              <w:spacing w:after="0" w:before="0" w:line="320" w:lineRule="auto"/>
-              <w:jc w:val="left"/>
-            </w:pPr>
-            <w:r>
-              <w:rPr>
-                <w:rFonts w:ascii="Arial" w:cs="Arial" w:eastAsia="Arial" w:hAnsi="Arial"/>
-                <w:sz w:val="20"/>
-                <w:szCs w:val="20"/>
-              </w:rPr>
-              <w:t xml:space="preserve">Swimming 20, football 30 (2 pictures stand for 10 children, so 1 picture stands for 5)</w:t>
-            </w:r>
-          </w:p>
-        </w:tc>
-      </w:tr>
-      <w:tr>
-        <w:trPr>
-          <w:cantSplit/>
-        </w:trPr>
-        <w:tc>
-          <w:tcPr>
-            <w:tcW w:type="dxa" w:w="4600"/>
-            <w:tcBorders>
-              <w:top w:val="single" w:color="000000" w:sz="8"/>
-              <w:left w:val="single" w:color="000000" w:sz="8"/>
-              <w:bottom w:val="single" w:color="000000" w:sz="8"/>
-              <w:right w:val="single" w:color="000000" w:sz="8"/>
-            </w:tcBorders>
-            <w:tcMar>
-              <w:top w:type="dxa" w:w="70"/>
-              <w:left w:type="dxa" w:w="100"/>
-              <w:bottom w:type="dxa" w:w="70"/>
-              <w:right w:type="dxa" w:w="100"/>
-            </w:tcMar>
-            <w:vAlign w:val="center"/>
-          </w:tcPr>
-          <w:p>
-            <w:pPr>
-              <w:keepLines/>
-              <w:spacing w:after="0" w:before="0" w:line="320" w:lineRule="auto"/>
-              <w:jc w:val="left"/>
-            </w:pPr>
-            <w:r>
-              <w:rPr>
-                <w:rFonts w:ascii="Arial" w:cs="Arial" w:eastAsia="Arial" w:hAnsi="Arial"/>
-                <w:sz w:val="20"/>
-                <w:szCs w:val="20"/>
-              </w:rPr>
-              <w:t xml:space="preserve">Workbook Challenge 6: Ali, Ben, Mei and Siti each have one coin: 10¢, 20¢, 50¢ or $1. Mei has more money than Ali but less than Ben. Ben does not have the $1 coin. Who has which coin?</w:t>
-            </w:r>
-          </w:p>
-        </w:tc>
-        <w:tc>
-          <w:tcPr>
-            <w:tcW w:type="dxa" w:w="5300"/>
-            <w:tcBorders>
-              <w:top w:val="single" w:color="000000" w:sz="8"/>
-              <w:left w:val="single" w:color="000000" w:sz="8"/>
-              <w:bottom w:val="single" w:color="000000" w:sz="8"/>
-              <w:right w:val="single" w:color="000000" w:sz="8"/>
-            </w:tcBorders>
-            <w:tcMar>
-              <w:top w:type="dxa" w:w="70"/>
-              <w:left w:type="dxa" w:w="100"/>
-              <w:bottom w:type="dxa" w:w="70"/>
-              <w:right w:type="dxa" w:w="100"/>
-            </w:tcMar>
-            <w:vAlign w:val="center"/>
-          </w:tcPr>
-          <w:p>
-            <w:pPr>
-              <w:keepLines/>
-              <w:spacing w:after="0" w:before="0" w:line="320" w:lineRule="auto"/>
-              <w:jc w:val="left"/>
-            </w:pPr>
-            <w:r>
-              <w:rPr>
-                <w:rFonts w:ascii="Arial" w:cs="Arial" w:eastAsia="Arial" w:hAnsi="Arial"/>
-                <w:sz w:val="20"/>
-                <w:szCs w:val="20"/>
-              </w:rPr>
-              <w:t xml:space="preserve">Ali 10¢, Mei 20¢, Ben 50¢, Siti $1. Ben is not $1 and two people have less than him, so Ben has 50¢; then Ali 10¢ and Mei 20¢, and Siti has the $1.</w:t>
-            </w:r>
-          </w:p>
-        </w:tc>
-      </w:tr>
-      <w:tr>
-        <w:trPr>
-          <w:cantSplit/>
-        </w:trPr>
-        <w:tc>
-          <w:tcPr>
-            <w:tcW w:type="dxa" w:w="4600"/>
-            <w:tcBorders>
-              <w:top w:val="single" w:color="000000" w:sz="8"/>
-              <w:left w:val="single" w:color="000000" w:sz="8"/>
-              <w:bottom w:val="single" w:color="000000" w:sz="8"/>
-              <w:right w:val="single" w:color="000000" w:sz="8"/>
-            </w:tcBorders>
-            <w:tcMar>
-              <w:top w:type="dxa" w:w="70"/>
-              <w:left w:type="dxa" w:w="100"/>
-              <w:bottom w:type="dxa" w:w="70"/>
-              <w:right w:type="dxa" w:w="100"/>
-            </w:tcMar>
-            <w:vAlign w:val="center"/>
-          </w:tcPr>
-          <w:p>
-            <w:pPr>
-              <w:keepLines/>
-              <w:spacing w:after="0" w:before="0" w:line="320" w:lineRule="auto"/>
-              <w:jc w:val="left"/>
-            </w:pPr>
-            <w:r>
-              <w:rPr>
-                <w:rFonts w:ascii="Arial" w:cs="Arial" w:eastAsia="Arial" w:hAnsi="Arial"/>
-                <w:sz w:val="20"/>
-                <w:szCs w:val="20"/>
-              </w:rPr>
-              <w:t xml:space="preserve">Workbook Challenge 7: At a hawker centre, chicken rice costs $4 a plate and noodles cost $3 a bowl. Ravi’s family buys 7 dishes for $25. How many plates of chicken rice do they buy?</w:t>
-            </w:r>
-          </w:p>
-        </w:tc>
-        <w:tc>
-          <w:tcPr>
-            <w:tcW w:type="dxa" w:w="5300"/>
-            <w:tcBorders>
-              <w:top w:val="single" w:color="000000" w:sz="8"/>
-              <w:left w:val="single" w:color="000000" w:sz="8"/>
-              <w:bottom w:val="single" w:color="000000" w:sz="8"/>
-              <w:right w:val="single" w:color="000000" w:sz="8"/>
-            </w:tcBorders>
-            <w:tcMar>
-              <w:top w:type="dxa" w:w="70"/>
-              <w:left w:type="dxa" w:w="100"/>
-              <w:bottom w:type="dxa" w:w="70"/>
-              <w:right w:type="dxa" w:w="100"/>
-            </w:tcMar>
-            <w:vAlign w:val="center"/>
-          </w:tcPr>
-          <w:p>
-            <w:pPr>
-              <w:keepLines/>
-              <w:spacing w:after="0" w:before="0" w:line="320" w:lineRule="auto"/>
-              <w:jc w:val="left"/>
-            </w:pPr>
-            <w:r>
-              <w:rPr>
-                <w:rFonts w:ascii="Arial" w:cs="Arial" w:eastAsia="Arial" w:hAnsi="Arial"/>
-                <w:sz w:val="20"/>
-                <w:szCs w:val="20"/>
-              </w:rPr>
-              <w:t xml:space="preserve">4 plates of chicken rice and 3 bowls of noodles ($16 + $9 = $25). Table: 0 → $21, 1 → $22, 2 → $23, 3 → $24, 4 → $25 ✓</w:t>
+              <w:t xml:space="preserve">3 goats and 4 chickens. Table: 0 goats 14 legs, 1 goat 16, 2 goats 18, 3 goats 20 ✓. Check: 12 + 8 = 20.</w:t>
             </w:r>
           </w:p>
         </w:tc>
@@ -46991,16 +46222,124 @@
     <w:p>
       <w:pPr>
         <w:keepLines/>
-        <w:spacing w:after="80" w:before="0" w:line="280" w:lineRule="auto"/>
-      </w:pPr>
-      <w:r>
-        <w:rPr>
-          <w:rFonts w:ascii="Arial" w:cs="Arial" w:eastAsia="Arial" w:hAnsi="Arial"/>
-          <w:color w:val="666666"/>
+        <w:spacing w:after="50" w:before="0" w:line="280" w:lineRule="auto"/>
+        <w:ind w:left="900" w:hanging="900"/>
+      </w:pPr>
+      <w:r>
+        <w:rPr>
+          <w:rFonts w:ascii="Arial" w:cs="Arial" w:eastAsia="Arial" w:hAnsi="Arial"/>
+          <w:b/>
+          <w:bCs/>
+          <w:color w:val="1F6F5C"/>
           <w:sz w:val="19"/>
           <w:szCs w:val="19"/>
         </w:rPr>
-        <w:t xml:space="preserve">These are the questions on the two Think Harder pages in the workbook. More are in the separate Question Bank.</w:t>
+        <w:t xml:space="preserve">SAY   </w:t>
+      </w:r>
+      <w:r>
+        <w:rPr>
+          <w:rFonts w:ascii="Arial" w:cs="Arial" w:eastAsia="Arial" w:hAnsi="Arial"/>
+          <w:i/>
+          <w:iCs/>
+          <w:sz w:val="21"/>
+          <w:szCs w:val="21"/>
+        </w:rPr>
+        <w:t xml:space="preserve">“The key idea today is: how to start a puzzle. Stuck? Draw it, list it in order, or make a table. Say it with me.”</w:t>
+      </w:r>
+    </w:p>
+    <w:p>
+      <w:pPr>
+        <w:keepLines/>
+        <w:spacing w:after="40" w:before="0" w:line="280" w:lineRule="auto"/>
+        <w:ind w:left="900" w:hanging="900"/>
+      </w:pPr>
+      <w:r>
+        <w:rPr>
+          <w:rFonts w:ascii="Arial" w:cs="Arial" w:eastAsia="Arial" w:hAnsi="Arial"/>
+          <w:b/>
+          <w:bCs/>
+          <w:color w:val="7F6000"/>
+          <w:sz w:val="19"/>
+          <w:szCs w:val="19"/>
+        </w:rPr>
+        <w:t xml:space="preserve">DO     </w:t>
+      </w:r>
+      <w:r>
+        <w:rPr>
+          <w:rFonts w:ascii="Arial" w:cs="Arial" w:eastAsia="Arial" w:hAnsi="Arial"/>
+          <w:sz w:val="21"/>
+          <w:szCs w:val="21"/>
+        </w:rPr>
+        <w:t xml:space="preserve">Show the key idea slide at about minutes 31 to 32. The “common mistakes” on that slide are for you, not the children. Watch for them during the worksheet:</w:t>
+      </w:r>
+    </w:p>
+    <w:p>
+      <w:pPr>
+        <w:keepLines/>
+        <w:spacing w:after="40" w:before="0" w:line="280" w:lineRule="auto"/>
+        <w:ind w:left="420" w:hanging="220"/>
+      </w:pPr>
+      <w:r>
+        <w:rPr>
+          <w:rFonts w:ascii="Arial" w:cs="Arial" w:eastAsia="Arial" w:hAnsi="Arial"/>
+          <w:sz w:val="21"/>
+          <w:szCs w:val="21"/>
+        </w:rPr>
+        <w:t xml:space="preserve">•  </w:t>
+      </w:r>
+      <w:r>
+        <w:rPr>
+          <w:rFonts w:ascii="Arial" w:cs="Arial" w:eastAsia="Arial" w:hAnsi="Arial"/>
+          <w:sz w:val="21"/>
+          <w:szCs w:val="21"/>
+        </w:rPr>
+        <w:t xml:space="preserve">Picture graph: counting the pictures instead of using the key (writing 6 instead of 30 for Tuesday).</w:t>
+      </w:r>
+    </w:p>
+    <w:p>
+      <w:pPr>
+        <w:keepLines/>
+        <w:spacing w:after="40" w:before="0" w:line="280" w:lineRule="auto"/>
+        <w:ind w:left="420" w:hanging="220"/>
+      </w:pPr>
+      <w:r>
+        <w:rPr>
+          <w:rFonts w:ascii="Arial" w:cs="Arial" w:eastAsia="Arial" w:hAnsi="Arial"/>
+          <w:sz w:val="21"/>
+          <w:szCs w:val="21"/>
+        </w:rPr>
+        <w:t xml:space="preserve">•  </w:t>
+      </w:r>
+      <w:r>
+        <w:rPr>
+          <w:rFonts w:ascii="Arial" w:cs="Arial" w:eastAsia="Arial" w:hAnsi="Arial"/>
+          <w:sz w:val="21"/>
+          <w:szCs w:val="21"/>
+        </w:rPr>
+        <w:t xml:space="preserve">Listing: putting 0 first (038 is not a 3-digit number) or missing a number because the list is not in order.</w:t>
+      </w:r>
+    </w:p>
+    <w:p>
+      <w:pPr>
+        <w:keepLines/>
+        <w:spacing w:after="40" w:before="0" w:line="280" w:lineRule="auto"/>
+        <w:ind w:left="420" w:hanging="220"/>
+      </w:pPr>
+      <w:r>
+        <w:rPr>
+          <w:rFonts w:ascii="Arial" w:cs="Arial" w:eastAsia="Arial" w:hAnsi="Arial"/>
+          <w:sz w:val="21"/>
+          <w:szCs w:val="21"/>
+        </w:rPr>
+        <w:t xml:space="preserve">•  </w:t>
+      </w:r>
+      <w:r>
+        <w:rPr>
+          <w:rFonts w:ascii="Arial" w:cs="Arial" w:eastAsia="Arial" w:hAnsi="Arial"/>
+          <w:sz w:val="21"/>
+          <w:szCs w:val="21"/>
+        </w:rPr>
+        <w:t xml:space="preserve">Logic grid: putting a tick without crossing out the rest of that row and column, so the next clue cannot be used.</w:t>
       </w:r>
     </w:p>
     <w:p>
@@ -47019,7 +46358,7 @@
           <w:sz w:val="22"/>
           <w:szCs w:val="22"/>
         </w:rPr>
-        <w:t xml:space="preserve">70–80 min   </w:t>
+        <w:t xml:space="preserve">32–36 min   </w:t>
       </w:r>
       <w:r>
         <w:rPr>
@@ -47030,7 +46369,7 @@
           <w:sz w:val="22"/>
           <w:szCs w:val="22"/>
         </w:rPr>
-        <w:t xml:space="preserve">Talk time</w:t>
+        <w:t xml:space="preserve">Brain break</w:t>
       </w:r>
     </w:p>
     <w:p>
@@ -47056,7 +46395,115 @@
           <w:sz w:val="21"/>
           <w:szCs w:val="21"/>
         </w:rPr>
-        <w:t xml:space="preserve">Bring the group back to a circle (or camera on, mics on). Ask two or three children to share, not only the fastest.</w:t>
+        <w:t xml:space="preserve">Freeze with maths. Dance until the music stops, then make the shape the tutor calls with your arms: a semicircle, a quarter circle, a cone, a cuboid.</w:t>
+      </w:r>
+    </w:p>
+    <w:p>
+      <w:pPr>
+        <w:keepLines/>
+        <w:spacing w:after="40" w:before="0" w:line="280" w:lineRule="auto"/>
+        <w:ind w:left="900" w:hanging="900"/>
+      </w:pPr>
+      <w:r>
+        <w:rPr>
+          <w:rFonts w:ascii="Arial" w:cs="Arial" w:eastAsia="Arial" w:hAnsi="Arial"/>
+          <w:b/>
+          <w:bCs/>
+          <w:color w:val="7F6000"/>
+          <w:sz w:val="19"/>
+          <w:szCs w:val="19"/>
+        </w:rPr>
+        <w:t xml:space="preserve">          </w:t>
+      </w:r>
+      <w:r>
+        <w:rPr>
+          <w:rFonts w:ascii="Arial" w:cs="Arial" w:eastAsia="Arial" w:hAnsi="Arial"/>
+          <w:sz w:val="21"/>
+          <w:szCs w:val="21"/>
+        </w:rPr>
+        <w:t xml:space="preserve">Water. Toilet break for anyone who needs it. Keep it to four minutes.</w:t>
+      </w:r>
+    </w:p>
+    <w:p>
+      <w:pPr>
+        <w:keepNext/>
+        <w:keepLines/>
+        <w:shd w:fill="1F3864" w:color="auto" w:val="clear"/>
+        <w:spacing w:after="60" w:before="160" w:line="320" w:lineRule="auto"/>
+      </w:pPr>
+      <w:r>
+        <w:rPr>
+          <w:rFonts w:ascii="Arial" w:cs="Arial" w:eastAsia="Arial" w:hAnsi="Arial"/>
+          <w:b/>
+          <w:bCs/>
+          <w:color w:val="FFFFFF"/>
+          <w:sz w:val="22"/>
+          <w:szCs w:val="22"/>
+        </w:rPr>
+        <w:t xml:space="preserve">36–72 min   </w:t>
+      </w:r>
+      <w:r>
+        <w:rPr>
+          <w:rFonts w:ascii="Arial" w:cs="Arial" w:eastAsia="Arial" w:hAnsi="Arial"/>
+          <w:b/>
+          <w:bCs/>
+          <w:color w:val="FFFFFF"/>
+          <w:sz w:val="22"/>
+          <w:szCs w:val="22"/>
+        </w:rPr>
+        <w:t xml:space="preserve">Worksheet (pairs, then alone, then stretch)</w:t>
+      </w:r>
+    </w:p>
+    <w:p>
+      <w:pPr>
+        <w:keepLines/>
+        <w:spacing w:after="40" w:before="0" w:line="280" w:lineRule="auto"/>
+        <w:ind w:left="900" w:hanging="900"/>
+      </w:pPr>
+      <w:r>
+        <w:rPr>
+          <w:rFonts w:ascii="Arial" w:cs="Arial" w:eastAsia="Arial" w:hAnsi="Arial"/>
+          <w:b/>
+          <w:bCs/>
+          <w:color w:val="7F6000"/>
+          <w:sz w:val="19"/>
+          <w:szCs w:val="19"/>
+        </w:rPr>
+        <w:t xml:space="preserve">DO     </w:t>
+      </w:r>
+      <w:r>
+        <w:rPr>
+          <w:rFonts w:ascii="Arial" w:cs="Arial" w:eastAsia="Arial" w:hAnsi="Arial"/>
+          <w:sz w:val="21"/>
+          <w:szCs w:val="21"/>
+        </w:rPr>
+        <w:t xml:space="preserve">Minute 36: give out the workbook. Read the title of Lesson 10 aloud. Say “Pairs first. Talk before you write.”</w:t>
+      </w:r>
+    </w:p>
+    <w:p>
+      <w:pPr>
+        <w:keepLines/>
+        <w:spacing w:after="40" w:before="0" w:line="280" w:lineRule="auto"/>
+        <w:ind w:left="900" w:hanging="900"/>
+      </w:pPr>
+      <w:r>
+        <w:rPr>
+          <w:rFonts w:ascii="Arial" w:cs="Arial" w:eastAsia="Arial" w:hAnsi="Arial"/>
+          <w:b/>
+          <w:bCs/>
+          <w:color w:val="7F6000"/>
+          <w:sz w:val="19"/>
+          <w:szCs w:val="19"/>
+        </w:rPr>
+        <w:t xml:space="preserve">          </w:t>
+      </w:r>
+      <w:r>
+        <w:rPr>
+          <w:rFonts w:ascii="Arial" w:cs="Arial" w:eastAsia="Arial" w:hAnsi="Arial"/>
+          <w:sz w:val="21"/>
+          <w:szCs w:val="21"/>
+        </w:rPr>
+        <w:t xml:space="preserve">Minutes 36 to 50: pairs work together on the first page (in Lessons 5, 6 and 10 a short teach slide comes first, 36 to 38). Minutes 50 to 52: check page 1 together. Minutes 52 to 57: short teaching for page 2. Minutes 57 to 69: each child works alone on the second page. Minutes 69 to 72: check page 2 together. Stretch and challenge are for early finishers at any time after the first page.</w:t>
       </w:r>
     </w:p>
     <w:p>
@@ -47084,13 +46531,13 @@
           <w:sz w:val="21"/>
           <w:szCs w:val="21"/>
         </w:rPr>
-        <w:t xml:space="preserve">“Which puzzle was hardest today? How did you start it?”</w:t>
-      </w:r>
-    </w:p>
-    <w:p>
-      <w:pPr>
-        <w:keepLines/>
-        <w:spacing w:after="50" w:before="0" w:line="280" w:lineRule="auto"/>
+        <w:t xml:space="preserve">“Pairs first. Read each question aloud and talk about it before you write. I am not looking for speed. I am looking for good thinking.”</w:t>
+      </w:r>
+    </w:p>
+    <w:p>
+      <w:pPr>
+        <w:keepLines/>
+        <w:spacing w:after="40" w:before="0" w:line="280" w:lineRule="auto"/>
         <w:ind w:left="900" w:hanging="900"/>
       </w:pPr>
       <w:r>
@@ -47098,21 +46545,210 @@
           <w:rFonts w:ascii="Arial" w:cs="Arial" w:eastAsia="Arial" w:hAnsi="Arial"/>
           <w:b/>
           <w:bCs/>
-          <w:color w:val="1F6F5C"/>
+          <w:color w:val="7F6000"/>
           <w:sz w:val="19"/>
           <w:szCs w:val="19"/>
         </w:rPr>
-        <w:t xml:space="preserve">          </w:t>
-      </w:r>
-      <w:r>
-        <w:rPr>
-          <w:rFonts w:ascii="Arial" w:cs="Arial" w:eastAsia="Arial" w:hAnsi="Arial"/>
-          <w:i/>
-          <w:iCs/>
-          <w:sz w:val="21"/>
-          <w:szCs w:val="21"/>
-        </w:rPr>
-        <w:t xml:space="preserve">“When is a table better than a drawing?”</w:t>
+        <w:t xml:space="preserve">DO     </w:t>
+      </w:r>
+      <w:r>
+        <w:rPr>
+          <w:rFonts w:ascii="Arial" w:cs="Arial" w:eastAsia="Arial" w:hAnsi="Arial"/>
+          <w:sz w:val="21"/>
+          <w:szCs w:val="21"/>
+        </w:rPr>
+        <w:t xml:space="preserve">Circulate and ask:</w:t>
+      </w:r>
+    </w:p>
+    <w:p>
+      <w:pPr>
+        <w:keepLines/>
+        <w:spacing w:after="40" w:before="0" w:line="280" w:lineRule="auto"/>
+        <w:ind w:left="420" w:hanging="220"/>
+      </w:pPr>
+      <w:r>
+        <w:rPr>
+          <w:rFonts w:ascii="Arial" w:cs="Arial" w:eastAsia="Arial" w:hAnsi="Arial"/>
+          <w:sz w:val="21"/>
+          <w:szCs w:val="21"/>
+        </w:rPr>
+        <w:t xml:space="preserve">•  </w:t>
+      </w:r>
+      <w:r>
+        <w:rPr>
+          <w:rFonts w:ascii="Arial" w:cs="Arial" w:eastAsia="Arial" w:hAnsi="Arial"/>
+          <w:sz w:val="21"/>
+          <w:szCs w:val="21"/>
+        </w:rPr>
+        <w:t xml:space="preserve">Ask: “How did you start this one? Draw, list or table?”</w:t>
+      </w:r>
+    </w:p>
+    <w:p>
+      <w:pPr>
+        <w:keepLines/>
+        <w:spacing w:after="40" w:before="0" w:line="280" w:lineRule="auto"/>
+        <w:ind w:left="420" w:hanging="220"/>
+      </w:pPr>
+      <w:r>
+        <w:rPr>
+          <w:rFonts w:ascii="Arial" w:cs="Arial" w:eastAsia="Arial" w:hAnsi="Arial"/>
+          <w:sz w:val="21"/>
+          <w:szCs w:val="21"/>
+        </w:rPr>
+        <w:t xml:space="preserve">•  </w:t>
+      </w:r>
+      <w:r>
+        <w:rPr>
+          <w:rFonts w:ascii="Arial" w:cs="Arial" w:eastAsia="Arial" w:hAnsi="Arial"/>
+          <w:sz w:val="21"/>
+          <w:szCs w:val="21"/>
+        </w:rPr>
+        <w:t xml:space="preserve">Ask: “How do you know there is only one answer?”</w:t>
+      </w:r>
+    </w:p>
+    <w:p>
+      <w:pPr>
+        <w:keepLines/>
+        <w:spacing w:after="40" w:before="0" w:line="280" w:lineRule="auto"/>
+        <w:ind w:left="420" w:hanging="220"/>
+      </w:pPr>
+      <w:r>
+        <w:rPr>
+          <w:rFonts w:ascii="Arial" w:cs="Arial" w:eastAsia="Arial" w:hAnsi="Arial"/>
+          <w:sz w:val="21"/>
+          <w:szCs w:val="21"/>
+        </w:rPr>
+        <w:t xml:space="preserve">•  </w:t>
+      </w:r>
+      <w:r>
+        <w:rPr>
+          <w:rFonts w:ascii="Arial" w:cs="Arial" w:eastAsia="Arial" w:hAnsi="Arial"/>
+          <w:sz w:val="21"/>
+          <w:szCs w:val="21"/>
+        </w:rPr>
+        <w:t xml:space="preserve">Ask: “Show me your check.”</w:t>
+      </w:r>
+    </w:p>
+    <w:p>
+      <w:pPr>
+        <w:keepLines/>
+        <w:spacing w:after="40" w:before="0" w:line="280" w:lineRule="auto"/>
+        <w:ind w:left="1300" w:hanging="1300"/>
+      </w:pPr>
+      <w:r>
+        <w:rPr>
+          <w:rFonts w:ascii="Arial" w:cs="Arial" w:eastAsia="Arial" w:hAnsi="Arial"/>
+          <w:b/>
+          <w:bCs/>
+          <w:color w:val="A61C00"/>
+          <w:sz w:val="19"/>
+          <w:szCs w:val="19"/>
+        </w:rPr>
+        <w:t xml:space="preserve">IF STUCK   </w:t>
+      </w:r>
+      <w:r>
+        <w:rPr>
+          <w:rFonts w:ascii="Arial" w:cs="Arial" w:eastAsia="Arial" w:hAnsi="Arial"/>
+          <w:sz w:val="21"/>
+          <w:szCs w:val="21"/>
+        </w:rPr>
+        <w:t xml:space="preserve">Hint 1: “Which lesson does this remind you of?”</w:t>
+      </w:r>
+    </w:p>
+    <w:p>
+      <w:pPr>
+        <w:keepLines/>
+        <w:spacing w:after="40" w:before="0" w:line="280" w:lineRule="auto"/>
+        <w:ind w:left="1300" w:hanging="1300"/>
+      </w:pPr>
+      <w:r>
+        <w:rPr>
+          <w:rFonts w:ascii="Arial" w:cs="Arial" w:eastAsia="Arial" w:hAnsi="Arial"/>
+          <w:b/>
+          <w:bCs/>
+          <w:color w:val="A61C00"/>
+          <w:sz w:val="19"/>
+          <w:szCs w:val="19"/>
+        </w:rPr>
+        <w:t xml:space="preserve">                </w:t>
+      </w:r>
+      <w:r>
+        <w:rPr>
+          <w:rFonts w:ascii="Arial" w:cs="Arial" w:eastAsia="Arial" w:hAnsi="Arial"/>
+          <w:sz w:val="21"/>
+          <w:szCs w:val="21"/>
+        </w:rPr>
+        <w:t xml:space="preserve">Hint 2: “Draw it, list it in order, or make a table.”</w:t>
+      </w:r>
+    </w:p>
+    <w:p>
+      <w:pPr>
+        <w:keepLines/>
+        <w:spacing w:after="40" w:before="0" w:line="280" w:lineRule="auto"/>
+        <w:ind w:left="1300" w:hanging="1300"/>
+      </w:pPr>
+      <w:r>
+        <w:rPr>
+          <w:rFonts w:ascii="Arial" w:cs="Arial" w:eastAsia="Arial" w:hAnsi="Arial"/>
+          <w:b/>
+          <w:bCs/>
+          <w:color w:val="A61C00"/>
+          <w:sz w:val="19"/>
+          <w:szCs w:val="19"/>
+        </w:rPr>
+        <w:t xml:space="preserve">                </w:t>
+      </w:r>
+      <w:r>
+        <w:rPr>
+          <w:rFonts w:ascii="Arial" w:cs="Arial" w:eastAsia="Arial" w:hAnsi="Arial"/>
+          <w:sz w:val="21"/>
+          <w:szCs w:val="21"/>
+        </w:rPr>
+        <w:t xml:space="preserve">Hint 3: “Try a small number first, then change it one step at a time.”</w:t>
+      </w:r>
+    </w:p>
+    <w:p>
+      <w:pPr>
+        <w:keepLines/>
+        <w:spacing w:after="40" w:before="0" w:line="280" w:lineRule="auto"/>
+        <w:ind w:left="900" w:hanging="900"/>
+      </w:pPr>
+      <w:r>
+        <w:rPr>
+          <w:rFonts w:ascii="Arial" w:cs="Arial" w:eastAsia="Arial" w:hAnsi="Arial"/>
+          <w:b/>
+          <w:bCs/>
+          <w:color w:val="7F6000"/>
+          <w:sz w:val="19"/>
+          <w:szCs w:val="19"/>
+        </w:rPr>
+        <w:t xml:space="preserve">DO     </w:t>
+      </w:r>
+      <w:r>
+        <w:rPr>
+          <w:rFonts w:ascii="Arial" w:cs="Arial" w:eastAsia="Arial" w:hAnsi="Arial"/>
+          <w:sz w:val="21"/>
+          <w:szCs w:val="21"/>
+        </w:rPr>
+        <w:t xml:space="preserve">Early finishers: give the stretch question first, then the challenge.</w:t>
+      </w:r>
+    </w:p>
+    <w:p>
+      <w:pPr>
+        <w:keepNext/>
+        <w:keepLines/>
+        <w:spacing w:after="60" w:before="160" w:line="320" w:lineRule="auto"/>
+      </w:pPr>
+      <w:r>
+        <w:rPr>
+          <w:rFonts w:ascii="Arial" w:cs="Arial" w:eastAsia="Arial" w:hAnsi="Arial"/>
+          <w:b/>
+          <w:bCs/>
+          <w:color w:val="1F3864"/>
+          <w:sz w:val="24"/>
+          <w:szCs w:val="24"/>
+        </w:rPr>
+        <w:t xml:space="preserve">Stretch and challenge questions</w:t>
       </w:r>
     </w:p>
     <w:tbl>
@@ -47167,7 +46803,7 @@
                 <w:sz w:val="20"/>
                 <w:szCs w:val="20"/>
               </w:rPr>
-              <w:t xml:space="preserve">Discussion question</w:t>
+              <w:t xml:space="preserve">Question</w:t>
             </w:r>
           </w:p>
         </w:tc>
@@ -47203,7 +46839,7 @@
                 <w:sz w:val="20"/>
                 <w:szCs w:val="20"/>
               </w:rPr>
-              <w:t xml:space="preserve">Listen for</w:t>
+              <w:t xml:space="preserve">Answer</w:t>
             </w:r>
           </w:p>
         </w:tc>
@@ -47241,7 +46877,7 @@
                 <w:sz w:val="20"/>
                 <w:szCs w:val="20"/>
               </w:rPr>
-              <w:t xml:space="preserve">Pick one puzzle and teach it to the group in two sentences: how you started it, and how you know your answer is right.</w:t>
+              <w:t xml:space="preserve">Workbook Think Harder 1: 30 children chose a fruit. In the picture graph each ● stands for 5 children. Apple has ●● and banana has ●●●. The mango row is missing. How many ● should the mango row have?</w:t>
             </w:r>
           </w:p>
         </w:tc>
@@ -47274,7 +46910,433 @@
                 <w:sz w:val="20"/>
                 <w:szCs w:val="20"/>
               </w:rPr>
-              <w:t xml:space="preserve">Open answers. Listen for a clear start (I drew bars, I listed in order, I made a table) and a check (I put my answer back into the puzzle). A table is good when we try 0, 1, 2, 3 … and something grows each time; a drawing is good for before-and-after stories and more-than or fewer-than.</w:t>
+              <w:t xml:space="preserve">1 ● (apple 10, banana 15, so mango is 30 − 25 = 5 children)</w:t>
+            </w:r>
+          </w:p>
+        </w:tc>
+      </w:tr>
+      <w:tr>
+        <w:trPr>
+          <w:cantSplit/>
+        </w:trPr>
+        <w:tc>
+          <w:tcPr>
+            <w:tcW w:type="dxa" w:w="4600"/>
+            <w:tcBorders>
+              <w:top w:val="single" w:color="000000" w:sz="8"/>
+              <w:left w:val="single" w:color="000000" w:sz="8"/>
+              <w:bottom w:val="single" w:color="000000" w:sz="8"/>
+              <w:right w:val="single" w:color="000000" w:sz="8"/>
+            </w:tcBorders>
+            <w:tcMar>
+              <w:top w:type="dxa" w:w="70"/>
+              <w:left w:type="dxa" w:w="100"/>
+              <w:bottom w:type="dxa" w:w="70"/>
+              <w:right w:type="dxa" w:w="100"/>
+            </w:tcMar>
+            <w:vAlign w:val="center"/>
+          </w:tcPr>
+          <w:p>
+            <w:pPr>
+              <w:keepLines/>
+              <w:spacing w:after="0" w:before="0" w:line="320" w:lineRule="auto"/>
+              <w:jc w:val="left"/>
+            </w:pPr>
+            <w:r>
+              <w:rPr>
+                <w:rFonts w:ascii="Arial" w:cs="Arial" w:eastAsia="Arial" w:hAnsi="Arial"/>
+                <w:sz w:val="20"/>
+                <w:szCs w:val="20"/>
+              </w:rPr>
+              <w:t xml:space="preserve">Workbook Think Harder 2: How many 3-digit numbers have digits that add up to 3? List them all.</w:t>
+            </w:r>
+          </w:p>
+        </w:tc>
+        <w:tc>
+          <w:tcPr>
+            <w:tcW w:type="dxa" w:w="5300"/>
+            <w:tcBorders>
+              <w:top w:val="single" w:color="000000" w:sz="8"/>
+              <w:left w:val="single" w:color="000000" w:sz="8"/>
+              <w:bottom w:val="single" w:color="000000" w:sz="8"/>
+              <w:right w:val="single" w:color="000000" w:sz="8"/>
+            </w:tcBorders>
+            <w:tcMar>
+              <w:top w:type="dxa" w:w="70"/>
+              <w:left w:type="dxa" w:w="100"/>
+              <w:bottom w:type="dxa" w:w="70"/>
+              <w:right w:type="dxa" w:w="100"/>
+            </w:tcMar>
+            <w:vAlign w:val="center"/>
+          </w:tcPr>
+          <w:p>
+            <w:pPr>
+              <w:keepLines/>
+              <w:spacing w:after="0" w:before="0" w:line="320" w:lineRule="auto"/>
+              <w:jc w:val="left"/>
+            </w:pPr>
+            <w:r>
+              <w:rPr>
+                <w:rFonts w:ascii="Arial" w:cs="Arial" w:eastAsia="Arial" w:hAnsi="Arial"/>
+                <w:sz w:val="20"/>
+                <w:szCs w:val="20"/>
+              </w:rPr>
+              <w:t xml:space="preserve">6: 102, 111, 120, 201, 210, 300</w:t>
+            </w:r>
+          </w:p>
+        </w:tc>
+      </w:tr>
+      <w:tr>
+        <w:trPr>
+          <w:cantSplit/>
+        </w:trPr>
+        <w:tc>
+          <w:tcPr>
+            <w:tcW w:type="dxa" w:w="4600"/>
+            <w:tcBorders>
+              <w:top w:val="single" w:color="000000" w:sz="8"/>
+              <w:left w:val="single" w:color="000000" w:sz="8"/>
+              <w:bottom w:val="single" w:color="000000" w:sz="8"/>
+              <w:right w:val="single" w:color="000000" w:sz="8"/>
+            </w:tcBorders>
+            <w:tcMar>
+              <w:top w:type="dxa" w:w="70"/>
+              <w:left w:type="dxa" w:w="100"/>
+              <w:bottom w:type="dxa" w:w="70"/>
+              <w:right w:type="dxa" w:w="100"/>
+            </w:tcMar>
+            <w:vAlign w:val="center"/>
+          </w:tcPr>
+          <w:p>
+            <w:pPr>
+              <w:keepLines/>
+              <w:spacing w:after="0" w:before="0" w:line="320" w:lineRule="auto"/>
+              <w:jc w:val="left"/>
+            </w:pPr>
+            <w:r>
+              <w:rPr>
+                <w:rFonts w:ascii="Arial" w:cs="Arial" w:eastAsia="Arial" w:hAnsi="Arial"/>
+                <w:sz w:val="20"/>
+                <w:szCs w:val="20"/>
+              </w:rPr>
+              <w:t xml:space="preserve">Workbook Think Harder 3: Ravi has 4 boxes of 5 pencils and 3 boxes of 10 pencils. He shares all the pencils equally among 5 friends. How many does each friend get?</w:t>
+            </w:r>
+          </w:p>
+        </w:tc>
+        <w:tc>
+          <w:tcPr>
+            <w:tcW w:type="dxa" w:w="5300"/>
+            <w:tcBorders>
+              <w:top w:val="single" w:color="000000" w:sz="8"/>
+              <w:left w:val="single" w:color="000000" w:sz="8"/>
+              <w:bottom w:val="single" w:color="000000" w:sz="8"/>
+              <w:right w:val="single" w:color="000000" w:sz="8"/>
+            </w:tcBorders>
+            <w:tcMar>
+              <w:top w:type="dxa" w:w="70"/>
+              <w:left w:type="dxa" w:w="100"/>
+              <w:bottom w:type="dxa" w:w="70"/>
+              <w:right w:type="dxa" w:w="100"/>
+            </w:tcMar>
+            <w:vAlign w:val="center"/>
+          </w:tcPr>
+          <w:p>
+            <w:pPr>
+              <w:keepLines/>
+              <w:spacing w:after="0" w:before="0" w:line="320" w:lineRule="auto"/>
+              <w:jc w:val="left"/>
+            </w:pPr>
+            <w:r>
+              <w:rPr>
+                <w:rFonts w:ascii="Arial" w:cs="Arial" w:eastAsia="Arial" w:hAnsi="Arial"/>
+                <w:sz w:val="20"/>
+                <w:szCs w:val="20"/>
+              </w:rPr>
+              <w:t xml:space="preserve">10 (20 + 30 = 50 pencils; 50 ÷ 5 = 10)</w:t>
+            </w:r>
+          </w:p>
+        </w:tc>
+      </w:tr>
+      <w:tr>
+        <w:trPr>
+          <w:cantSplit/>
+        </w:trPr>
+        <w:tc>
+          <w:tcPr>
+            <w:tcW w:type="dxa" w:w="4600"/>
+            <w:tcBorders>
+              <w:top w:val="single" w:color="000000" w:sz="8"/>
+              <w:left w:val="single" w:color="000000" w:sz="8"/>
+              <w:bottom w:val="single" w:color="000000" w:sz="8"/>
+              <w:right w:val="single" w:color="000000" w:sz="8"/>
+            </w:tcBorders>
+            <w:tcMar>
+              <w:top w:type="dxa" w:w="70"/>
+              <w:left w:type="dxa" w:w="100"/>
+              <w:bottom w:type="dxa" w:w="70"/>
+              <w:right w:type="dxa" w:w="100"/>
+            </w:tcMar>
+            <w:vAlign w:val="center"/>
+          </w:tcPr>
+          <w:p>
+            <w:pPr>
+              <w:keepLines/>
+              <w:spacing w:after="0" w:before="0" w:line="320" w:lineRule="auto"/>
+              <w:jc w:val="left"/>
+            </w:pPr>
+            <w:r>
+              <w:rPr>
+                <w:rFonts w:ascii="Arial" w:cs="Arial" w:eastAsia="Arial" w:hAnsi="Arial"/>
+                <w:sz w:val="20"/>
+                <w:szCs w:val="20"/>
+              </w:rPr>
+              <w:t xml:space="preserve">Workbook Think Harder 4: 5, 9, 13, 17, … What is the 10th number in this pattern?</w:t>
+            </w:r>
+          </w:p>
+        </w:tc>
+        <w:tc>
+          <w:tcPr>
+            <w:tcW w:type="dxa" w:w="5300"/>
+            <w:tcBorders>
+              <w:top w:val="single" w:color="000000" w:sz="8"/>
+              <w:left w:val="single" w:color="000000" w:sz="8"/>
+              <w:bottom w:val="single" w:color="000000" w:sz="8"/>
+              <w:right w:val="single" w:color="000000" w:sz="8"/>
+            </w:tcBorders>
+            <w:tcMar>
+              <w:top w:type="dxa" w:w="70"/>
+              <w:left w:type="dxa" w:w="100"/>
+              <w:bottom w:type="dxa" w:w="70"/>
+              <w:right w:type="dxa" w:w="100"/>
+            </w:tcMar>
+            <w:vAlign w:val="center"/>
+          </w:tcPr>
+          <w:p>
+            <w:pPr>
+              <w:keepLines/>
+              <w:spacing w:after="0" w:before="0" w:line="320" w:lineRule="auto"/>
+              <w:jc w:val="left"/>
+            </w:pPr>
+            <w:r>
+              <w:rPr>
+                <w:rFonts w:ascii="Arial" w:cs="Arial" w:eastAsia="Arial" w:hAnsi="Arial"/>
+                <w:sz w:val="20"/>
+                <w:szCs w:val="20"/>
+              </w:rPr>
+              <w:t xml:space="preserve">41 (add 4: 21, 25, 29, 33, 37, 41)</w:t>
+            </w:r>
+          </w:p>
+        </w:tc>
+      </w:tr>
+      <w:tr>
+        <w:trPr>
+          <w:cantSplit/>
+        </w:trPr>
+        <w:tc>
+          <w:tcPr>
+            <w:tcW w:type="dxa" w:w="4600"/>
+            <w:tcBorders>
+              <w:top w:val="single" w:color="000000" w:sz="8"/>
+              <w:left w:val="single" w:color="000000" w:sz="8"/>
+              <w:bottom w:val="single" w:color="000000" w:sz="8"/>
+              <w:right w:val="single" w:color="000000" w:sz="8"/>
+            </w:tcBorders>
+            <w:tcMar>
+              <w:top w:type="dxa" w:w="70"/>
+              <w:left w:type="dxa" w:w="100"/>
+              <w:bottom w:type="dxa" w:w="70"/>
+              <w:right w:type="dxa" w:w="100"/>
+            </w:tcMar>
+            <w:vAlign w:val="center"/>
+          </w:tcPr>
+          <w:p>
+            <w:pPr>
+              <w:keepLines/>
+              <w:spacing w:after="0" w:before="0" w:line="320" w:lineRule="auto"/>
+              <w:jc w:val="left"/>
+            </w:pPr>
+            <w:r>
+              <w:rPr>
+                <w:rFonts w:ascii="Arial" w:cs="Arial" w:eastAsia="Arial" w:hAnsi="Arial"/>
+                <w:sz w:val="20"/>
+                <w:szCs w:val="20"/>
+              </w:rPr>
+              <w:t xml:space="preserve">Workbook Challenge 5: A picture graph has lost its key. Football has 6 pictures and swimming has 4 pictures. 10 more children chose football than swimming. How many children chose swimming? Football?</w:t>
+            </w:r>
+          </w:p>
+        </w:tc>
+        <w:tc>
+          <w:tcPr>
+            <w:tcW w:type="dxa" w:w="5300"/>
+            <w:tcBorders>
+              <w:top w:val="single" w:color="000000" w:sz="8"/>
+              <w:left w:val="single" w:color="000000" w:sz="8"/>
+              <w:bottom w:val="single" w:color="000000" w:sz="8"/>
+              <w:right w:val="single" w:color="000000" w:sz="8"/>
+            </w:tcBorders>
+            <w:tcMar>
+              <w:top w:type="dxa" w:w="70"/>
+              <w:left w:type="dxa" w:w="100"/>
+              <w:bottom w:type="dxa" w:w="70"/>
+              <w:right w:type="dxa" w:w="100"/>
+            </w:tcMar>
+            <w:vAlign w:val="center"/>
+          </w:tcPr>
+          <w:p>
+            <w:pPr>
+              <w:keepLines/>
+              <w:spacing w:after="0" w:before="0" w:line="320" w:lineRule="auto"/>
+              <w:jc w:val="left"/>
+            </w:pPr>
+            <w:r>
+              <w:rPr>
+                <w:rFonts w:ascii="Arial" w:cs="Arial" w:eastAsia="Arial" w:hAnsi="Arial"/>
+                <w:sz w:val="20"/>
+                <w:szCs w:val="20"/>
+              </w:rPr>
+              <w:t xml:space="preserve">Swimming 20, football 30 (2 pictures stand for 10 children, so 1 picture stands for 5)</w:t>
+            </w:r>
+          </w:p>
+        </w:tc>
+      </w:tr>
+      <w:tr>
+        <w:trPr>
+          <w:cantSplit/>
+        </w:trPr>
+        <w:tc>
+          <w:tcPr>
+            <w:tcW w:type="dxa" w:w="4600"/>
+            <w:tcBorders>
+              <w:top w:val="single" w:color="000000" w:sz="8"/>
+              <w:left w:val="single" w:color="000000" w:sz="8"/>
+              <w:bottom w:val="single" w:color="000000" w:sz="8"/>
+              <w:right w:val="single" w:color="000000" w:sz="8"/>
+            </w:tcBorders>
+            <w:tcMar>
+              <w:top w:type="dxa" w:w="70"/>
+              <w:left w:type="dxa" w:w="100"/>
+              <w:bottom w:type="dxa" w:w="70"/>
+              <w:right w:type="dxa" w:w="100"/>
+            </w:tcMar>
+            <w:vAlign w:val="center"/>
+          </w:tcPr>
+          <w:p>
+            <w:pPr>
+              <w:keepLines/>
+              <w:spacing w:after="0" w:before="0" w:line="320" w:lineRule="auto"/>
+              <w:jc w:val="left"/>
+            </w:pPr>
+            <w:r>
+              <w:rPr>
+                <w:rFonts w:ascii="Arial" w:cs="Arial" w:eastAsia="Arial" w:hAnsi="Arial"/>
+                <w:sz w:val="20"/>
+                <w:szCs w:val="20"/>
+              </w:rPr>
+              <w:t xml:space="preserve">Workbook Challenge 6: Ali, Ben, Mei and Siti each have one coin: 10¢, 20¢, 50¢ or $1. Mei has more money than Ali but less than Ben. Ben does not have the $1 coin. Who has which coin?</w:t>
+            </w:r>
+          </w:p>
+        </w:tc>
+        <w:tc>
+          <w:tcPr>
+            <w:tcW w:type="dxa" w:w="5300"/>
+            <w:tcBorders>
+              <w:top w:val="single" w:color="000000" w:sz="8"/>
+              <w:left w:val="single" w:color="000000" w:sz="8"/>
+              <w:bottom w:val="single" w:color="000000" w:sz="8"/>
+              <w:right w:val="single" w:color="000000" w:sz="8"/>
+            </w:tcBorders>
+            <w:tcMar>
+              <w:top w:type="dxa" w:w="70"/>
+              <w:left w:type="dxa" w:w="100"/>
+              <w:bottom w:type="dxa" w:w="70"/>
+              <w:right w:type="dxa" w:w="100"/>
+            </w:tcMar>
+            <w:vAlign w:val="center"/>
+          </w:tcPr>
+          <w:p>
+            <w:pPr>
+              <w:keepLines/>
+              <w:spacing w:after="0" w:before="0" w:line="320" w:lineRule="auto"/>
+              <w:jc w:val="left"/>
+            </w:pPr>
+            <w:r>
+              <w:rPr>
+                <w:rFonts w:ascii="Arial" w:cs="Arial" w:eastAsia="Arial" w:hAnsi="Arial"/>
+                <w:sz w:val="20"/>
+                <w:szCs w:val="20"/>
+              </w:rPr>
+              <w:t xml:space="preserve">Ali 10¢, Mei 20¢, Ben 50¢, Siti $1. Ben is not $1 and two people have less than him, so Ben has 50¢; then Ali 10¢ and Mei 20¢, and Siti has the $1.</w:t>
+            </w:r>
+          </w:p>
+        </w:tc>
+      </w:tr>
+      <w:tr>
+        <w:trPr>
+          <w:cantSplit/>
+        </w:trPr>
+        <w:tc>
+          <w:tcPr>
+            <w:tcW w:type="dxa" w:w="4600"/>
+            <w:tcBorders>
+              <w:top w:val="single" w:color="000000" w:sz="8"/>
+              <w:left w:val="single" w:color="000000" w:sz="8"/>
+              <w:bottom w:val="single" w:color="000000" w:sz="8"/>
+              <w:right w:val="single" w:color="000000" w:sz="8"/>
+            </w:tcBorders>
+            <w:tcMar>
+              <w:top w:type="dxa" w:w="70"/>
+              <w:left w:type="dxa" w:w="100"/>
+              <w:bottom w:type="dxa" w:w="70"/>
+              <w:right w:type="dxa" w:w="100"/>
+            </w:tcMar>
+            <w:vAlign w:val="center"/>
+          </w:tcPr>
+          <w:p>
+            <w:pPr>
+              <w:keepLines/>
+              <w:spacing w:after="0" w:before="0" w:line="320" w:lineRule="auto"/>
+              <w:jc w:val="left"/>
+            </w:pPr>
+            <w:r>
+              <w:rPr>
+                <w:rFonts w:ascii="Arial" w:cs="Arial" w:eastAsia="Arial" w:hAnsi="Arial"/>
+                <w:sz w:val="20"/>
+                <w:szCs w:val="20"/>
+              </w:rPr>
+              <w:t xml:space="preserve">Workbook Challenge 7: At a hawker centre, chicken rice costs $4 a plate and noodles cost $3 a bowl. Ravi’s family buys 7 dishes for $25. How many plates of chicken rice do they buy?</w:t>
+            </w:r>
+          </w:p>
+        </w:tc>
+        <w:tc>
+          <w:tcPr>
+            <w:tcW w:type="dxa" w:w="5300"/>
+            <w:tcBorders>
+              <w:top w:val="single" w:color="000000" w:sz="8"/>
+              <w:left w:val="single" w:color="000000" w:sz="8"/>
+              <w:bottom w:val="single" w:color="000000" w:sz="8"/>
+              <w:right w:val="single" w:color="000000" w:sz="8"/>
+            </w:tcBorders>
+            <w:tcMar>
+              <w:top w:type="dxa" w:w="70"/>
+              <w:left w:type="dxa" w:w="100"/>
+              <w:bottom w:type="dxa" w:w="70"/>
+              <w:right w:type="dxa" w:w="100"/>
+            </w:tcMar>
+            <w:vAlign w:val="center"/>
+          </w:tcPr>
+          <w:p>
+            <w:pPr>
+              <w:keepLines/>
+              <w:spacing w:after="0" w:before="0" w:line="320" w:lineRule="auto"/>
+              <w:jc w:val="left"/>
+            </w:pPr>
+            <w:r>
+              <w:rPr>
+                <w:rFonts w:ascii="Arial" w:cs="Arial" w:eastAsia="Arial" w:hAnsi="Arial"/>
+                <w:sz w:val="20"/>
+                <w:szCs w:val="20"/>
+              </w:rPr>
+              <w:t xml:space="preserve">4 plates of chicken rice and 3 bowls of noodles ($16 + $9 = $25). Table: 0 → $21, 1 → $22, 2 → $23, 3 → $24, 4 → $25 ✓</w:t>
             </w:r>
           </w:p>
         </w:tc>
@@ -47292,6 +47354,21 @@
           <w:szCs w:val="26"/>
         </w:rPr>
         <w:t xml:space="preserve"/>
+      </w:r>
+    </w:p>
+    <w:p>
+      <w:pPr>
+        <w:keepLines/>
+        <w:spacing w:after="80" w:before="0" w:line="280" w:lineRule="auto"/>
+      </w:pPr>
+      <w:r>
+        <w:rPr>
+          <w:rFonts w:ascii="Arial" w:cs="Arial" w:eastAsia="Arial" w:hAnsi="Arial"/>
+          <w:color w:val="666666"/>
+          <w:sz w:val="19"/>
+          <w:szCs w:val="19"/>
+        </w:rPr>
+        <w:t xml:space="preserve">These are the questions on the two Think Harder pages in the workbook. More are in the separate Question Bank.</w:t>
       </w:r>
     </w:p>
     <w:p>
@@ -47310,7 +47387,7 @@
           <w:sz w:val="22"/>
           <w:szCs w:val="22"/>
         </w:rPr>
-        <w:t xml:space="preserve">80–90 min   </w:t>
+        <w:t xml:space="preserve">72–80 min   </w:t>
       </w:r>
       <w:r>
         <w:rPr>
@@ -47321,7 +47398,7 @@
           <w:sz w:val="22"/>
           <w:szCs w:val="22"/>
         </w:rPr>
-        <w:t xml:space="preserve">Exit ticket and closing</w:t>
+        <w:t xml:space="preserve">Talk time</w:t>
       </w:r>
     </w:p>
     <w:p>
@@ -47347,7 +47424,63 @@
           <w:sz w:val="21"/>
           <w:szCs w:val="21"/>
         </w:rPr>
-        <w:t xml:space="preserve">Give each child a slip of paper (or ask them to write on their journal page). No talking, no helping. Show the exit ticket slide.</w:t>
+        <w:t xml:space="preserve">Bring the group back to a circle (or camera on, mics on). Ask two or three children to share, not only the fastest.</w:t>
+      </w:r>
+    </w:p>
+    <w:p>
+      <w:pPr>
+        <w:keepLines/>
+        <w:spacing w:after="50" w:before="0" w:line="280" w:lineRule="auto"/>
+        <w:ind w:left="900" w:hanging="900"/>
+      </w:pPr>
+      <w:r>
+        <w:rPr>
+          <w:rFonts w:ascii="Arial" w:cs="Arial" w:eastAsia="Arial" w:hAnsi="Arial"/>
+          <w:b/>
+          <w:bCs/>
+          <w:color w:val="1F6F5C"/>
+          <w:sz w:val="19"/>
+          <w:szCs w:val="19"/>
+        </w:rPr>
+        <w:t xml:space="preserve">SAY   </w:t>
+      </w:r>
+      <w:r>
+        <w:rPr>
+          <w:rFonts w:ascii="Arial" w:cs="Arial" w:eastAsia="Arial" w:hAnsi="Arial"/>
+          <w:i/>
+          <w:iCs/>
+          <w:sz w:val="21"/>
+          <w:szCs w:val="21"/>
+        </w:rPr>
+        <w:t xml:space="preserve">“Which puzzle was hardest today? How did you start it?”</w:t>
+      </w:r>
+    </w:p>
+    <w:p>
+      <w:pPr>
+        <w:keepLines/>
+        <w:spacing w:after="50" w:before="0" w:line="280" w:lineRule="auto"/>
+        <w:ind w:left="900" w:hanging="900"/>
+      </w:pPr>
+      <w:r>
+        <w:rPr>
+          <w:rFonts w:ascii="Arial" w:cs="Arial" w:eastAsia="Arial" w:hAnsi="Arial"/>
+          <w:b/>
+          <w:bCs/>
+          <w:color w:val="1F6F5C"/>
+          <w:sz w:val="19"/>
+          <w:szCs w:val="19"/>
+        </w:rPr>
+        <w:t xml:space="preserve">          </w:t>
+      </w:r>
+      <w:r>
+        <w:rPr>
+          <w:rFonts w:ascii="Arial" w:cs="Arial" w:eastAsia="Arial" w:hAnsi="Arial"/>
+          <w:i/>
+          <w:iCs/>
+          <w:sz w:val="21"/>
+          <w:szCs w:val="21"/>
+        </w:rPr>
+        <w:t xml:space="preserve">“When is a table better than a drawing?”</w:t>
       </w:r>
     </w:p>
     <w:tbl>
@@ -47402,7 +47535,7 @@
                 <w:sz w:val="20"/>
                 <w:szCs w:val="20"/>
               </w:rPr>
-              <w:t xml:space="preserve">Exit ticket</w:t>
+              <w:t xml:space="preserve">Discussion question</w:t>
             </w:r>
           </w:p>
         </w:tc>
@@ -47438,7 +47571,7 @@
                 <w:sz w:val="20"/>
                 <w:szCs w:val="20"/>
               </w:rPr>
-              <w:t xml:space="preserve">Answer</w:t>
+              <w:t xml:space="preserve">Listen for</w:t>
             </w:r>
           </w:p>
         </w:tc>
@@ -47476,6 +47609,241 @@
                 <w:sz w:val="20"/>
                 <w:szCs w:val="20"/>
               </w:rPr>
+              <w:t xml:space="preserve">Pick one puzzle and teach it to the group in two sentences: how you started it, and how you know your answer is right.</w:t>
+            </w:r>
+          </w:p>
+        </w:tc>
+        <w:tc>
+          <w:tcPr>
+            <w:tcW w:type="dxa" w:w="5300"/>
+            <w:tcBorders>
+              <w:top w:val="single" w:color="000000" w:sz="8"/>
+              <w:left w:val="single" w:color="000000" w:sz="8"/>
+              <w:bottom w:val="single" w:color="000000" w:sz="8"/>
+              <w:right w:val="single" w:color="000000" w:sz="8"/>
+            </w:tcBorders>
+            <w:tcMar>
+              <w:top w:type="dxa" w:w="70"/>
+              <w:left w:type="dxa" w:w="100"/>
+              <w:bottom w:type="dxa" w:w="70"/>
+              <w:right w:type="dxa" w:w="100"/>
+            </w:tcMar>
+            <w:vAlign w:val="center"/>
+          </w:tcPr>
+          <w:p>
+            <w:pPr>
+              <w:keepLines/>
+              <w:spacing w:after="0" w:before="0" w:line="320" w:lineRule="auto"/>
+              <w:jc w:val="left"/>
+            </w:pPr>
+            <w:r>
+              <w:rPr>
+                <w:rFonts w:ascii="Arial" w:cs="Arial" w:eastAsia="Arial" w:hAnsi="Arial"/>
+                <w:sz w:val="20"/>
+                <w:szCs w:val="20"/>
+              </w:rPr>
+              <w:t xml:space="preserve">Open answers. Listen for a clear start (I drew bars, I listed in order, I made a table) and a check (I put my answer back into the puzzle). A table is good when we try 0, 1, 2, 3 … and something grows each time; a drawing is good for before-and-after stories and more-than or fewer-than.</w:t>
+            </w:r>
+          </w:p>
+        </w:tc>
+      </w:tr>
+    </w:tbl>
+    <w:p>
+      <w:pPr>
+        <w:keepLines/>
+        <w:spacing w:after="40" w:before="0" w:line="320" w:lineRule="auto"/>
+      </w:pPr>
+      <w:r>
+        <w:rPr>
+          <w:rFonts w:ascii="Arial" w:cs="Arial" w:eastAsia="Arial" w:hAnsi="Arial"/>
+          <w:sz w:val="26"/>
+          <w:szCs w:val="26"/>
+        </w:rPr>
+        <w:t xml:space="preserve"/>
+      </w:r>
+    </w:p>
+    <w:p>
+      <w:pPr>
+        <w:keepNext/>
+        <w:keepLines/>
+        <w:shd w:fill="1F3864" w:color="auto" w:val="clear"/>
+        <w:spacing w:after="60" w:before="160" w:line="320" w:lineRule="auto"/>
+      </w:pPr>
+      <w:r>
+        <w:rPr>
+          <w:rFonts w:ascii="Arial" w:cs="Arial" w:eastAsia="Arial" w:hAnsi="Arial"/>
+          <w:b/>
+          <w:bCs/>
+          <w:color w:val="FFFFFF"/>
+          <w:sz w:val="22"/>
+          <w:szCs w:val="22"/>
+        </w:rPr>
+        <w:t xml:space="preserve">80–90 min   </w:t>
+      </w:r>
+      <w:r>
+        <w:rPr>
+          <w:rFonts w:ascii="Arial" w:cs="Arial" w:eastAsia="Arial" w:hAnsi="Arial"/>
+          <w:b/>
+          <w:bCs/>
+          <w:color w:val="FFFFFF"/>
+          <w:sz w:val="22"/>
+          <w:szCs w:val="22"/>
+        </w:rPr>
+        <w:t xml:space="preserve">Exit ticket and closing</w:t>
+      </w:r>
+    </w:p>
+    <w:p>
+      <w:pPr>
+        <w:keepLines/>
+        <w:spacing w:after="40" w:before="0" w:line="280" w:lineRule="auto"/>
+        <w:ind w:left="900" w:hanging="900"/>
+      </w:pPr>
+      <w:r>
+        <w:rPr>
+          <w:rFonts w:ascii="Arial" w:cs="Arial" w:eastAsia="Arial" w:hAnsi="Arial"/>
+          <w:b/>
+          <w:bCs/>
+          <w:color w:val="7F6000"/>
+          <w:sz w:val="19"/>
+          <w:szCs w:val="19"/>
+        </w:rPr>
+        <w:t xml:space="preserve">DO     </w:t>
+      </w:r>
+      <w:r>
+        <w:rPr>
+          <w:rFonts w:ascii="Arial" w:cs="Arial" w:eastAsia="Arial" w:hAnsi="Arial"/>
+          <w:sz w:val="21"/>
+          <w:szCs w:val="21"/>
+        </w:rPr>
+        <w:t xml:space="preserve">Give each child a slip of paper (or ask them to write on their journal page). No talking, no helping. Show the exit ticket slide.</w:t>
+      </w:r>
+    </w:p>
+    <w:tbl>
+      <w:tblPr>
+        <w:tblW w:type="dxa" w:w="9900"/>
+        <w:tblBorders>
+          <w:top w:val="single" w:color="auto" w:sz="4"/>
+          <w:left w:val="single" w:color="auto" w:sz="4"/>
+          <w:bottom w:val="single" w:color="auto" w:sz="4"/>
+          <w:right w:val="single" w:color="auto" w:sz="4"/>
+          <w:insideH w:val="single" w:color="auto" w:sz="4"/>
+          <w:insideV w:val="single" w:color="auto" w:sz="4"/>
+        </w:tblBorders>
+      </w:tblPr>
+      <w:tblGrid>
+        <w:gridCol w:w="4600"/>
+        <w:gridCol w:w="5300"/>
+      </w:tblGrid>
+      <w:tr>
+        <w:trPr>
+          <w:cantSplit/>
+        </w:trPr>
+        <w:tc>
+          <w:tcPr>
+            <w:tcW w:type="dxa" w:w="4600"/>
+            <w:tcBorders>
+              <w:top w:val="single" w:color="000000" w:sz="8"/>
+              <w:left w:val="single" w:color="000000" w:sz="8"/>
+              <w:bottom w:val="single" w:color="000000" w:sz="8"/>
+              <w:right w:val="single" w:color="000000" w:sz="8"/>
+            </w:tcBorders>
+            <w:shd w:fill="D9E2F3" w:color="auto" w:val="clear"/>
+            <w:tcMar>
+              <w:top w:type="dxa" w:w="70"/>
+              <w:left w:type="dxa" w:w="100"/>
+              <w:bottom w:type="dxa" w:w="70"/>
+              <w:right w:type="dxa" w:w="100"/>
+            </w:tcMar>
+            <w:vAlign w:val="center"/>
+          </w:tcPr>
+          <w:p>
+            <w:pPr>
+              <w:keepLines/>
+              <w:spacing w:after="0" w:before="0" w:line="320" w:lineRule="auto"/>
+              <w:jc w:val="center"/>
+            </w:pPr>
+            <w:r>
+              <w:rPr>
+                <w:rFonts w:ascii="Arial" w:cs="Arial" w:eastAsia="Arial" w:hAnsi="Arial"/>
+                <w:b/>
+                <w:bCs/>
+                <w:sz w:val="20"/>
+                <w:szCs w:val="20"/>
+              </w:rPr>
+              <w:t xml:space="preserve">Exit ticket</w:t>
+            </w:r>
+          </w:p>
+        </w:tc>
+        <w:tc>
+          <w:tcPr>
+            <w:tcW w:type="dxa" w:w="5300"/>
+            <w:tcBorders>
+              <w:top w:val="single" w:color="000000" w:sz="8"/>
+              <w:left w:val="single" w:color="000000" w:sz="8"/>
+              <w:bottom w:val="single" w:color="000000" w:sz="8"/>
+              <w:right w:val="single" w:color="000000" w:sz="8"/>
+            </w:tcBorders>
+            <w:shd w:fill="D9E2F3" w:color="auto" w:val="clear"/>
+            <w:tcMar>
+              <w:top w:type="dxa" w:w="70"/>
+              <w:left w:type="dxa" w:w="100"/>
+              <w:bottom w:type="dxa" w:w="70"/>
+              <w:right w:type="dxa" w:w="100"/>
+            </w:tcMar>
+            <w:vAlign w:val="center"/>
+          </w:tcPr>
+          <w:p>
+            <w:pPr>
+              <w:keepLines/>
+              <w:spacing w:after="0" w:before="0" w:line="320" w:lineRule="auto"/>
+              <w:jc w:val="center"/>
+            </w:pPr>
+            <w:r>
+              <w:rPr>
+                <w:rFonts w:ascii="Arial" w:cs="Arial" w:eastAsia="Arial" w:hAnsi="Arial"/>
+                <w:b/>
+                <w:bCs/>
+                <w:sz w:val="20"/>
+                <w:szCs w:val="20"/>
+              </w:rPr>
+              <w:t xml:space="preserve">Answer</w:t>
+            </w:r>
+          </w:p>
+        </w:tc>
+      </w:tr>
+      <w:tr>
+        <w:trPr>
+          <w:cantSplit/>
+        </w:trPr>
+        <w:tc>
+          <w:tcPr>
+            <w:tcW w:type="dxa" w:w="4600"/>
+            <w:tcBorders>
+              <w:top w:val="single" w:color="000000" w:sz="8"/>
+              <w:left w:val="single" w:color="000000" w:sz="8"/>
+              <w:bottom w:val="single" w:color="000000" w:sz="8"/>
+              <w:right w:val="single" w:color="000000" w:sz="8"/>
+            </w:tcBorders>
+            <w:tcMar>
+              <w:top w:type="dxa" w:w="70"/>
+              <w:left w:type="dxa" w:w="100"/>
+              <w:bottom w:type="dxa" w:w="70"/>
+              <w:right w:type="dxa" w:w="100"/>
+            </w:tcMar>
+            <w:vAlign w:val="center"/>
+          </w:tcPr>
+          <w:p>
+            <w:pPr>
+              <w:keepLines/>
+              <w:spacing w:after="0" w:before="0" w:line="320" w:lineRule="auto"/>
+              <w:jc w:val="left"/>
+            </w:pPr>
+            <w:r>
+              <w:rPr>
+                <w:rFonts w:ascii="Arial" w:cs="Arial" w:eastAsia="Arial" w:hAnsi="Arial"/>
+                <w:sz w:val="20"/>
+                <w:szCs w:val="20"/>
+              </w:rPr>
               <w:t xml:space="preserve">5 bicycles and tricycles have 13 wheels altogether. How many tricycles are there? How did you start?</w:t>
             </w:r>
           </w:p>
@@ -47808,7 +48176,7 @@
           <w:sz w:val="20"/>
           <w:szCs w:val="20"/>
         </w:rPr>
-        <w:t xml:space="preserve">(a) 10, 12, 14: 6 tables seat 14 people  (b) 9 tables (each table adds 2 seats: 4, 6, 8, … 20)</w:t>
+        <w:t xml:space="preserve">(a) 16, 20, 24 cubes in Towers 4, 5, 6; Tower 8 has 32 cubes (each tower adds 4: 4, 8, 12, 16, 20, 24, 28, 32)  (b) Tower 9 (36 cubes: 4 × 9, or keep adding 4: 32, 36)</w:t>
       </w:r>
     </w:p>
     <w:p>

</xml_diff>

<commit_message>
P4 gifted-style audit and tier rework; rebuilt decks and printed set
Co-Authored-By: Claude Sonnet 5.5 <noreply@anthropic.com>
Claude-Session: https://claude.ai/code/session_01NYgB3ju57UwWRpkPPM6X7F
</commit_message>
<xml_diff>
--- a/p2/P2_Holiday_Program_Guide.docx
+++ b/p2/P2_Holiday_Program_Guide.docx
@@ -9898,7 +9898,7 @@
                 <w:sz w:val="20"/>
                 <w:szCs w:val="20"/>
               </w:rPr>
-              <w:t xml:space="preserve">Workbook Think Harder 4: Ben counts back in 100s from 980: 980, 880, 780 … He stops at the last 3-digit number. What is it? How many numbers did he say?</w:t>
+              <w:t xml:space="preserve">Workbook Think Harder 4: Mei says: “If I swap the tens digit and the ones digit of a 3-digit number, the new number is always smaller.” Is she right? Show what happens with some examples. When does the number stay the same?</w:t>
             </w:r>
           </w:p>
         </w:tc>
@@ -9931,7 +9931,7 @@
                 <w:sz w:val="20"/>
                 <w:szCs w:val="20"/>
               </w:rPr>
-              <w:t xml:space="preserve">180. He said 9 numbers: 980, 880, 780, 680, 580, 480, 380, 280, 180.</w:t>
+              <w:t xml:space="preserve">No. 452 becomes 425, which is smaller, but 425 becomes 452, which is bigger. It gets smaller when the tens digit is bigger than the ones digit, bigger when it is smaller, and stays the same when the two digits are the same (733).</w:t>
             </w:r>
           </w:p>
         </w:tc>
@@ -22333,7 +22333,7 @@
                 <w:sz w:val="20"/>
                 <w:szCs w:val="20"/>
               </w:rPr>
-              <w:t xml:space="preserve">Workbook Challenge 5: Mei counts in 4s from 4. Ben counts in 5s from 5. Which is bigger: Mei’s 10th number or Ben’s 8th number?</w:t>
+              <w:t xml:space="preserve">Workbook Challenge 5: Ali counts in 3s from 3. Mei counts in 4s from 4. They both say 12. Predict the next number they will BOTH say. Then list every number up to 100 that they both say. What do you notice? Why?</w:t>
             </w:r>
           </w:p>
         </w:tc>
@@ -22366,7 +22366,7 @@
                 <w:sz w:val="20"/>
                 <w:szCs w:val="20"/>
               </w:rPr>
-              <w:t xml:space="preserve">Neither: they are the same. Mei’s 10th number is 40 and Ben’s 8th number is 40.</w:t>
+              <w:t xml:space="preserve">24 is next. They both say 12, 24, 36, 48, 60, 72, 84 and 96 (8 numbers): the numbers go up by 12 each time, because 12 is the first number in both the 3 and 4 times tables, and each next one is 12 more.</w:t>
             </w:r>
           </w:p>
         </w:tc>
@@ -22404,7 +22404,7 @@
                 <w:sz w:val="20"/>
                 <w:szCs w:val="20"/>
               </w:rPr>
-              <w:t xml:space="preserve">Workbook Challenge 6: Siti builds towers of cubes. Tower 1 has 2 cubes, tower 2 has 5 cubes, tower 3 has 8 cubes. The towers keep growing in the same way. Which tower has 29 cubes?</w:t>
+              <w:t xml:space="preserve">Workbook Challenge 6: Siti builds towers of cubes. Tower 1 has 2 cubes, tower 2 has 5 cubes, tower 3 has 8 cubes. The towers keep growing in the same way. Which tower has 29 cubes? Is there a tower with exactly 50 cubes? With exactly 100 cubes? Explain how you know.</w:t>
             </w:r>
           </w:p>
         </w:tc>
@@ -22437,7 +22437,7 @@
                 <w:sz w:val="20"/>
                 <w:szCs w:val="20"/>
               </w:rPr>
-              <w:t xml:space="preserve">Tower 10. The rule is add 3: 2, 5, 8, 11, 14, 17, 20, 23, 26, 29.</w:t>
+              <w:t xml:space="preserve">Tower 10 has 29 cubes (the rule is add 3: 2, 5, 8, 11, … 29). Tower 17 has 50 cubes. No tower has 100: every tower has 1 less than a number in the 3 times table (tower 10: 30 − 1 = 29), and 101 is not in the 3 times table (99 and 102 are).</w:t>
             </w:r>
           </w:p>
         </w:tc>
@@ -30227,7 +30227,7 @@
                 <w:sz w:val="20"/>
                 <w:szCs w:val="20"/>
               </w:rPr>
-              <w:t xml:space="preserve">10 ways (two $5: 1 way; one $5: 3 ways; no $5: 6 ways)</w:t>
+              <w:t xml:space="preserve">10 ways (1 + 3 + 6)</w:t>
             </w:r>
           </w:p>
         </w:tc>
@@ -30336,7 +30336,7 @@
                 <w:sz w:val="20"/>
                 <w:szCs w:val="20"/>
               </w:rPr>
-              <w:t xml:space="preserve">Workbook Think Harder 3: A bun costs 70¢. Mei pays with a $1 coin. Which coins does she get as change, using the fewest coins?</w:t>
+              <w:t xml:space="preserve">Workbook Think Harder 3: How many different ways can you pay exactly 40¢ using 5¢, 10¢ and 20¢ coins? Make a list in order, starting with the most 20¢ coins.</w:t>
             </w:r>
           </w:p>
         </w:tc>
@@ -30369,7 +30369,7 @@
                 <w:sz w:val="20"/>
                 <w:szCs w:val="20"/>
               </w:rPr>
-              <w:t xml:space="preserve">30¢: 20¢ + 10¢</w:t>
+              <w:t xml:space="preserve">9 ways: two 20¢ (1 way); one 20¢ and 20¢ more (3 ways); no 20¢ (5 ways).</w:t>
             </w:r>
           </w:p>
         </w:tc>
@@ -30407,7 +30407,7 @@
                 <w:sz w:val="20"/>
                 <w:szCs w:val="20"/>
               </w:rPr>
-              <w:t xml:space="preserve">Workbook Think Harder 4: Ben has $30. He buys a book for $12 and a pen for $5. How much money does he have left? Can he also buy a game for $15?</w:t>
+              <w:t xml:space="preserve">Workbook Think Harder 4: Pens cost $3 each and books cost $7 each. Ben buys 6 things and spends exactly $30. How many pens and how many books does he buy? Make a table.</w:t>
             </w:r>
           </w:p>
         </w:tc>
@@ -30440,7 +30440,7 @@
                 <w:sz w:val="20"/>
                 <w:szCs w:val="20"/>
               </w:rPr>
-              <w:t xml:space="preserve">$13 left. No, he is $2 short.</w:t>
+              <w:t xml:space="preserve">3 pens and 3 books ($9 + $21 = $30). Table: 6 pens $18, 5 pens and 1 book $22, 4 and 2 $26, 3 and 3 $30 ✓. Each swap of a pen for a book adds $4.</w:t>
             </w:r>
           </w:p>
         </w:tc>
@@ -38336,7 +38336,7 @@
                 <w:sz w:val="20"/>
                 <w:szCs w:val="20"/>
               </w:rPr>
-              <w:t xml:space="preserve">Workbook Think Harder 1: How many quarter circles make 3 semicircles?</w:t>
+              <w:t xml:space="preserve">Workbook Think Harder 1: A stack of cubes has a bottom layer 4 cubes long and 3 cubes deep, a middle layer 3 cubes long and 2 cubes deep, and 1 cube on top. How many cubes are in the stack? Draw the layers.</w:t>
             </w:r>
           </w:p>
         </w:tc>
@@ -38369,7 +38369,7 @@
                 <w:sz w:val="20"/>
                 <w:szCs w:val="20"/>
               </w:rPr>
-              <w:t xml:space="preserve">6</w:t>
+              <w:t xml:space="preserve">19 (12 + 6 + 1)</w:t>
             </w:r>
           </w:p>
         </w:tc>
@@ -42404,7 +42404,7 @@
                 <w:sz w:val="20"/>
                 <w:szCs w:val="20"/>
               </w:rPr>
-              <w:t xml:space="preserve">Swap the pomelo for 3 apples: 5 apples balance 500 g, so one apple is 100 g. The pomelo is 300 g. Check: 300 + 100 + 100 = 500.</w:t>
+              <w:t xml:space="preserve">Apple 100 g, pomelo 300 g (5 apples balance 500 g).</w:t>
             </w:r>
           </w:p>
         </w:tc>
@@ -42475,7 +42475,7 @@
                 <w:sz w:val="20"/>
                 <w:szCs w:val="20"/>
               </w:rPr>
-              <w:t xml:space="preserve">Fill the 7 ℓ jug (0, 7). Pour into the 2 ℓ jug (2, 5). Empty the 2 ℓ jug (0, 5). Pour again (2, 3). 3 ℓ is left in the 7 ℓ jug.</w:t>
+              <w:t xml:space="preserve">Fill 7, pour into 2, empty 2, pour again: 3 ℓ is left in the 7 ℓ jug.</w:t>
             </w:r>
           </w:p>
         </w:tc>
@@ -46910,7 +46910,7 @@
                 <w:sz w:val="20"/>
                 <w:szCs w:val="20"/>
               </w:rPr>
-              <w:t xml:space="preserve">1 ● (apple 10, banana 15, so mango is 30 − 25 = 5 children)</w:t>
+              <w:t xml:space="preserve">1 ● (30 − 10 − 15 = 5 children)</w:t>
             </w:r>
           </w:p>
         </w:tc>
@@ -47019,7 +47019,7 @@
                 <w:sz w:val="20"/>
                 <w:szCs w:val="20"/>
               </w:rPr>
-              <w:t xml:space="preserve">Workbook Think Harder 3: Ravi has 4 boxes of 5 pencils and 3 boxes of 10 pencils. He shares all the pencils equally among 5 friends. How many does each friend get?</w:t>
+              <w:t xml:space="preserve">Workbook Think Harder 3: A bus had some people on it. At the first stop half of the people got off. At the second stop 6 people got on. Now there are 14 people on the bus. How many people were on the bus at the start? Draw a bar to start.</w:t>
             </w:r>
           </w:p>
         </w:tc>
@@ -47052,7 +47052,7 @@
                 <w:sz w:val="20"/>
                 <w:szCs w:val="20"/>
               </w:rPr>
-              <w:t xml:space="preserve">10 (20 + 30 = 50 pencils; 50 ÷ 5 = 10)</w:t>
+              <w:t xml:space="preserve">16 (14 − 6 = 8 is half, 8 + 8 = 16).</w:t>
             </w:r>
           </w:p>
         </w:tc>
@@ -47303,7 +47303,7 @@
                 <w:sz w:val="20"/>
                 <w:szCs w:val="20"/>
               </w:rPr>
-              <w:t xml:space="preserve">Workbook Challenge 7: At a hawker centre, chicken rice costs $4 a plate and noodles cost $3 a bowl. Ravi’s family buys 7 dishes for $25. How many plates of chicken rice do they buy?</w:t>
+              <w:t xml:space="preserve">Workbook Challenge 7: At a hawker centre, chicken rice costs $4 a plate and noodles cost $3 a bowl. Ravi’s family buys 7 dishes for $25. How many plates of chicken rice do they buy? What is the smallest total 7 dishes can cost? The biggest? Can 7 dishes cost $30? Can they cost EVERY whole-dollar amount in between?</w:t>
             </w:r>
           </w:p>
         </w:tc>
@@ -47336,7 +47336,7 @@
                 <w:sz w:val="20"/>
                 <w:szCs w:val="20"/>
               </w:rPr>
-              <w:t xml:space="preserve">4 plates of chicken rice and 3 bowls of noodles ($16 + $9 = $25). Table: 0 → $21, 1 → $22, 2 → $23, 3 → $24, 4 → $25 ✓</w:t>
+              <w:t xml:space="preserve">4 plates of chicken rice and 3 bowls of noodles ($16 + $9 = $25). Table: 0 plates → $21, 1 → $22, 2 → $23, 3 → $24, 4 → $25 ✓. Smallest $21 (all noodles), biggest $28 (all chicken rice), so $30 is impossible. Each swap of a bowl for a plate adds exactly $1, so every whole dollar from $21 to $28 is possible.</w:t>
             </w:r>
           </w:p>
         </w:tc>

</xml_diff>